<commit_message>
Limpieza de scripts, fallback mensaje para el usuario
</commit_message>
<xml_diff>
--- a/docs/Fases de diseño Proyecto Chatbot huertas urbanas.docx
+++ b/docs/Fases de diseño Proyecto Chatbot huertas urbanas.docx
@@ -1,6 +1,6 @@
 
 <file path=word/document.xml><?xml version="1.0" encoding="utf-8"?>
-<w:document xmlns:wpc="http://schemas.microsoft.com/office/word/2010/wordprocessingCanvas" xmlns:cx="http://schemas.microsoft.com/office/drawing/2014/chartex" xmlns:cx1="http://schemas.microsoft.com/office/drawing/2015/9/8/chartex" xmlns:cx2="http://schemas.microsoft.com/office/drawing/2015/10/21/chartex" xmlns:cx3="http://schemas.microsoft.com/office/drawing/2016/5/9/chartex" xmlns:cx4="http://schemas.microsoft.com/office/drawing/2016/5/10/chartex" xmlns:cx5="http://schemas.microsoft.com/office/drawing/2016/5/11/chartex" xmlns:cx6="http://schemas.microsoft.com/office/drawing/2016/5/12/chartex" xmlns:cx7="http://schemas.microsoft.com/office/drawing/2016/5/13/chartex" xmlns:cx8="http://schemas.microsoft.com/office/drawing/2016/5/14/chartex" xmlns:mc="http://schemas.openxmlformats.org/markup-compatibility/2006" xmlns:aink="http://schemas.microsoft.com/office/drawing/2016/ink" xmlns:am3d="http://schemas.microsoft.com/office/drawing/2017/model3d" xmlns:o="urn:schemas-microsoft-com:office:office" xmlns:oel="http://schemas.microsoft.com/office/2019/extlst" xmlns:r="http://schemas.openxmlformats.org/officeDocument/2006/relationships" xmlns:m="http://schemas.openxmlformats.org/officeDocument/2006/math" xmlns:v="urn:schemas-microsoft-com:vml" xmlns:wp14="http://schemas.microsoft.com/office/word/2010/wordprocessingDrawing" xmlns:wp="http://schemas.openxmlformats.org/drawingml/2006/wordprocessingDrawing" xmlns:w10="urn:schemas-microsoft-com:office:word" xmlns:w="http://schemas.openxmlformats.org/wordprocessingml/2006/main" xmlns:w14="http://schemas.microsoft.com/office/word/2010/wordml" xmlns:w15="http://schemas.microsoft.com/office/word/2012/wordml" xmlns:w16cex="http://schemas.microsoft.com/office/word/2018/wordml/cex" xmlns:w16cid="http://schemas.microsoft.com/office/word/2016/wordml/cid" xmlns:w16="http://schemas.microsoft.com/office/word/2018/wordml" xmlns:w16du="http://schemas.microsoft.com/office/word/2023/wordml/word16du" xmlns:w16sdtdh="http://schemas.microsoft.com/office/word/2020/wordml/sdtdatahash" xmlns:w16sdtfl="http://schemas.microsoft.com/office/word/2024/wordml/sdtformatlock" xmlns:w16se="http://schemas.microsoft.com/office/word/2015/wordml/symex" xmlns:wpg="http://schemas.microsoft.com/office/word/2010/wordprocessingGroup" xmlns:wpi="http://schemas.microsoft.com/office/word/2010/wordprocessingInk" xmlns:wne="http://schemas.microsoft.com/office/word/2006/wordml" xmlns:wps="http://schemas.microsoft.com/office/word/2010/wordprocessingShape" mc:Ignorable="w14 w15 w16se w16cid w16 w16cex w16sdtdh w16sdtfl w16du wp14">
+<w:document xmlns:wpc="http://schemas.microsoft.com/office/word/2010/wordprocessingCanvas" xmlns:cx="http://schemas.microsoft.com/office/drawing/2014/chartex" xmlns:cx1="http://schemas.microsoft.com/office/drawing/2015/9/8/chartex" xmlns:cx2="http://schemas.microsoft.com/office/drawing/2015/10/21/chartex" xmlns:cx3="http://schemas.microsoft.com/office/drawing/2016/5/9/chartex" xmlns:cx4="http://schemas.microsoft.com/office/drawing/2016/5/10/chartex" xmlns:cx5="http://schemas.microsoft.com/office/drawing/2016/5/11/chartex" xmlns:cx6="http://schemas.microsoft.com/office/drawing/2016/5/12/chartex" xmlns:cx7="http://schemas.microsoft.com/office/drawing/2016/5/13/chartex" xmlns:cx8="http://schemas.microsoft.com/office/drawing/2016/5/14/chartex" xmlns:mc="http://schemas.openxmlformats.org/markup-compatibility/2006" xmlns:aink="http://schemas.microsoft.com/office/drawing/2016/ink" xmlns:am3d="http://schemas.microsoft.com/office/drawing/2017/model3d" xmlns:o="urn:schemas-microsoft-com:office:office" xmlns:oel="http://schemas.microsoft.com/office/2019/extlst" xmlns:r="http://schemas.openxmlformats.org/officeDocument/2006/relationships" xmlns:m="http://schemas.openxmlformats.org/officeDocument/2006/math" xmlns:v="urn:schemas-microsoft-com:vml" xmlns:wp14="http://schemas.microsoft.com/office/word/2010/wordprocessingDrawing" xmlns:wp="http://schemas.openxmlformats.org/drawingml/2006/wordprocessingDrawing" xmlns:w10="urn:schemas-microsoft-com:office:word" xmlns:w="http://schemas.openxmlformats.org/wordprocessingml/2006/main" xmlns:w14="http://schemas.microsoft.com/office/word/2010/wordml" xmlns:w15="http://schemas.microsoft.com/office/word/2012/wordml" xmlns:w16cei="http://schemas.microsoft.com/office/word/2026/wordml/cei" xmlns:w16cex="http://schemas.microsoft.com/office/word/2018/wordml/cex" xmlns:w16cid="http://schemas.microsoft.com/office/word/2016/wordml/cid" xmlns:w16="http://schemas.microsoft.com/office/word/2018/wordml" xmlns:w16du="http://schemas.microsoft.com/office/word/2023/wordml/word16du" xmlns:w16sdtdh="http://schemas.microsoft.com/office/word/2020/wordml/sdtdatahash" xmlns:w16sdtfl="http://schemas.microsoft.com/office/word/2024/wordml/sdtformatlock" xmlns:w16se="http://schemas.microsoft.com/office/word/2015/wordml/symex" xmlns:wpg="http://schemas.microsoft.com/office/word/2010/wordprocessingGroup" xmlns:wpi="http://schemas.microsoft.com/office/word/2010/wordprocessingInk" xmlns:wne="http://schemas.microsoft.com/office/word/2006/wordml" xmlns:wps="http://schemas.microsoft.com/office/word/2010/wordprocessingShape" mc:Ignorable="w14 w15 w16se w16cid w16 w16cex w16sdtdh w16sdtfl w16du wp14">
   <w:body>
     <w:p>
       <w:pPr>
@@ -145,12 +145,6 @@
         <w:gridCol w:w="5060"/>
       </w:tblGrid>
       <w:tr>
-        <w:tblPrEx>
-          <w:tblCellMar>
-            <w:top w:w="0" w:type="dxa"/>
-            <w:bottom w:w="0" w:type="dxa"/>
-          </w:tblCellMar>
-        </w:tblPrEx>
         <w:trPr>
           <w:tblHeader/>
         </w:trPr>
@@ -261,12 +255,6 @@
         </w:tc>
       </w:tr>
       <w:tr>
-        <w:tblPrEx>
-          <w:tblCellMar>
-            <w:top w:w="0" w:type="dxa"/>
-            <w:bottom w:w="0" w:type="dxa"/>
-          </w:tblCellMar>
-        </w:tblPrEx>
         <w:tc>
           <w:tcPr>
             <w:tcW w:w="2600" w:type="dxa"/>
@@ -377,12 +365,6 @@
         </w:tc>
       </w:tr>
       <w:tr>
-        <w:tblPrEx>
-          <w:tblCellMar>
-            <w:top w:w="0" w:type="dxa"/>
-            <w:bottom w:w="0" w:type="dxa"/>
-          </w:tblCellMar>
-        </w:tblPrEx>
         <w:tc>
           <w:tcPr>
             <w:tcW w:w="2600" w:type="dxa"/>
@@ -509,12 +491,6 @@
         </w:tc>
       </w:tr>
       <w:tr>
-        <w:tblPrEx>
-          <w:tblCellMar>
-            <w:top w:w="0" w:type="dxa"/>
-            <w:bottom w:w="0" w:type="dxa"/>
-          </w:tblCellMar>
-        </w:tblPrEx>
         <w:tc>
           <w:tcPr>
             <w:tcW w:w="2600" w:type="dxa"/>
@@ -640,12 +616,6 @@
         </w:tc>
       </w:tr>
       <w:tr>
-        <w:tblPrEx>
-          <w:tblCellMar>
-            <w:top w:w="0" w:type="dxa"/>
-            <w:bottom w:w="0" w:type="dxa"/>
-          </w:tblCellMar>
-        </w:tblPrEx>
         <w:tc>
           <w:tcPr>
             <w:tcW w:w="2600" w:type="dxa"/>
@@ -980,12 +950,6 @@
         <w:gridCol w:w="6960"/>
       </w:tblGrid>
       <w:tr>
-        <w:tblPrEx>
-          <w:tblCellMar>
-            <w:top w:w="0" w:type="dxa"/>
-            <w:bottom w:w="0" w:type="dxa"/>
-          </w:tblCellMar>
-        </w:tblPrEx>
         <w:trPr>
           <w:tblHeader/>
         </w:trPr>
@@ -1061,12 +1025,6 @@
         </w:tc>
       </w:tr>
       <w:tr>
-        <w:tblPrEx>
-          <w:tblCellMar>
-            <w:top w:w="0" w:type="dxa"/>
-            <w:bottom w:w="0" w:type="dxa"/>
-          </w:tblCellMar>
-        </w:tblPrEx>
         <w:tc>
           <w:tcPr>
             <w:tcW w:w="2400" w:type="dxa"/>
@@ -1131,12 +1089,6 @@
         </w:tc>
       </w:tr>
       <w:tr>
-        <w:tblPrEx>
-          <w:tblCellMar>
-            <w:top w:w="0" w:type="dxa"/>
-            <w:bottom w:w="0" w:type="dxa"/>
-          </w:tblCellMar>
-        </w:tblPrEx>
         <w:tc>
           <w:tcPr>
             <w:tcW w:w="2400" w:type="dxa"/>
@@ -1201,12 +1153,6 @@
         </w:tc>
       </w:tr>
       <w:tr>
-        <w:tblPrEx>
-          <w:tblCellMar>
-            <w:top w:w="0" w:type="dxa"/>
-            <w:bottom w:w="0" w:type="dxa"/>
-          </w:tblCellMar>
-        </w:tblPrEx>
         <w:tc>
           <w:tcPr>
             <w:tcW w:w="2400" w:type="dxa"/>
@@ -1271,12 +1217,6 @@
         </w:tc>
       </w:tr>
       <w:tr>
-        <w:tblPrEx>
-          <w:tblCellMar>
-            <w:top w:w="0" w:type="dxa"/>
-            <w:bottom w:w="0" w:type="dxa"/>
-          </w:tblCellMar>
-        </w:tblPrEx>
         <w:tc>
           <w:tcPr>
             <w:tcW w:w="2400" w:type="dxa"/>
@@ -1350,12 +1290,6 @@
         </w:tc>
       </w:tr>
       <w:tr>
-        <w:tblPrEx>
-          <w:tblCellMar>
-            <w:top w:w="0" w:type="dxa"/>
-            <w:bottom w:w="0" w:type="dxa"/>
-          </w:tblCellMar>
-        </w:tblPrEx>
         <w:tc>
           <w:tcPr>
             <w:tcW w:w="2400" w:type="dxa"/>
@@ -1436,12 +1370,6 @@
         </w:tc>
       </w:tr>
       <w:tr>
-        <w:tblPrEx>
-          <w:tblCellMar>
-            <w:top w:w="0" w:type="dxa"/>
-            <w:bottom w:w="0" w:type="dxa"/>
-          </w:tblCellMar>
-        </w:tblPrEx>
         <w:tc>
           <w:tcPr>
             <w:tcW w:w="2400" w:type="dxa"/>
@@ -1538,12 +1466,6 @@
         </w:tc>
       </w:tr>
       <w:tr>
-        <w:tblPrEx>
-          <w:tblCellMar>
-            <w:top w:w="0" w:type="dxa"/>
-            <w:bottom w:w="0" w:type="dxa"/>
-          </w:tblCellMar>
-        </w:tblPrEx>
         <w:tc>
           <w:tcPr>
             <w:tcW w:w="2400" w:type="dxa"/>
@@ -1624,12 +1546,6 @@
         </w:tc>
       </w:tr>
       <w:tr>
-        <w:tblPrEx>
-          <w:tblCellMar>
-            <w:top w:w="0" w:type="dxa"/>
-            <w:bottom w:w="0" w:type="dxa"/>
-          </w:tblCellMar>
-        </w:tblPrEx>
         <w:tc>
           <w:tcPr>
             <w:tcW w:w="2400" w:type="dxa"/>
@@ -1753,12 +1669,6 @@
         <w:gridCol w:w="6960"/>
       </w:tblGrid>
       <w:tr>
-        <w:tblPrEx>
-          <w:tblCellMar>
-            <w:top w:w="0" w:type="dxa"/>
-            <w:bottom w:w="0" w:type="dxa"/>
-          </w:tblCellMar>
-        </w:tblPrEx>
         <w:trPr>
           <w:tblHeader/>
         </w:trPr>
@@ -1834,12 +1744,6 @@
         </w:tc>
       </w:tr>
       <w:tr>
-        <w:tblPrEx>
-          <w:tblCellMar>
-            <w:top w:w="0" w:type="dxa"/>
-            <w:bottom w:w="0" w:type="dxa"/>
-          </w:tblCellMar>
-        </w:tblPrEx>
         <w:tc>
           <w:tcPr>
             <w:tcW w:w="2400" w:type="dxa"/>
@@ -1904,12 +1808,6 @@
         </w:tc>
       </w:tr>
       <w:tr>
-        <w:tblPrEx>
-          <w:tblCellMar>
-            <w:top w:w="0" w:type="dxa"/>
-            <w:bottom w:w="0" w:type="dxa"/>
-          </w:tblCellMar>
-        </w:tblPrEx>
         <w:tc>
           <w:tcPr>
             <w:tcW w:w="2400" w:type="dxa"/>
@@ -1974,12 +1872,6 @@
         </w:tc>
       </w:tr>
       <w:tr>
-        <w:tblPrEx>
-          <w:tblCellMar>
-            <w:top w:w="0" w:type="dxa"/>
-            <w:bottom w:w="0" w:type="dxa"/>
-          </w:tblCellMar>
-        </w:tblPrEx>
         <w:tc>
           <w:tcPr>
             <w:tcW w:w="2400" w:type="dxa"/>
@@ -2044,12 +1936,6 @@
         </w:tc>
       </w:tr>
       <w:tr>
-        <w:tblPrEx>
-          <w:tblCellMar>
-            <w:top w:w="0" w:type="dxa"/>
-            <w:bottom w:w="0" w:type="dxa"/>
-          </w:tblCellMar>
-        </w:tblPrEx>
         <w:tc>
           <w:tcPr>
             <w:tcW w:w="2400" w:type="dxa"/>
@@ -2130,12 +2016,6 @@
         </w:tc>
       </w:tr>
       <w:tr>
-        <w:tblPrEx>
-          <w:tblCellMar>
-            <w:top w:w="0" w:type="dxa"/>
-            <w:bottom w:w="0" w:type="dxa"/>
-          </w:tblCellMar>
-        </w:tblPrEx>
         <w:tc>
           <w:tcPr>
             <w:tcW w:w="2400" w:type="dxa"/>
@@ -2200,12 +2080,6 @@
         </w:tc>
       </w:tr>
       <w:tr>
-        <w:tblPrEx>
-          <w:tblCellMar>
-            <w:top w:w="0" w:type="dxa"/>
-            <w:bottom w:w="0" w:type="dxa"/>
-          </w:tblCellMar>
-        </w:tblPrEx>
         <w:tc>
           <w:tcPr>
             <w:tcW w:w="2400" w:type="dxa"/>
@@ -2302,12 +2176,6 @@
         </w:tc>
       </w:tr>
       <w:tr>
-        <w:tblPrEx>
-          <w:tblCellMar>
-            <w:top w:w="0" w:type="dxa"/>
-            <w:bottom w:w="0" w:type="dxa"/>
-          </w:tblCellMar>
-        </w:tblPrEx>
         <w:tc>
           <w:tcPr>
             <w:tcW w:w="2400" w:type="dxa"/>
@@ -2388,12 +2256,6 @@
         </w:tc>
       </w:tr>
       <w:tr>
-        <w:tblPrEx>
-          <w:tblCellMar>
-            <w:top w:w="0" w:type="dxa"/>
-            <w:bottom w:w="0" w:type="dxa"/>
-          </w:tblCellMar>
-        </w:tblPrEx>
         <w:tc>
           <w:tcPr>
             <w:tcW w:w="2400" w:type="dxa"/>
@@ -2516,12 +2378,6 @@
         <w:gridCol w:w="6960"/>
       </w:tblGrid>
       <w:tr>
-        <w:tblPrEx>
-          <w:tblCellMar>
-            <w:top w:w="0" w:type="dxa"/>
-            <w:bottom w:w="0" w:type="dxa"/>
-          </w:tblCellMar>
-        </w:tblPrEx>
         <w:trPr>
           <w:tblHeader/>
         </w:trPr>
@@ -2597,12 +2453,6 @@
         </w:tc>
       </w:tr>
       <w:tr>
-        <w:tblPrEx>
-          <w:tblCellMar>
-            <w:top w:w="0" w:type="dxa"/>
-            <w:bottom w:w="0" w:type="dxa"/>
-          </w:tblCellMar>
-        </w:tblPrEx>
         <w:tc>
           <w:tcPr>
             <w:tcW w:w="2400" w:type="dxa"/>
@@ -2667,12 +2517,6 @@
         </w:tc>
       </w:tr>
       <w:tr>
-        <w:tblPrEx>
-          <w:tblCellMar>
-            <w:top w:w="0" w:type="dxa"/>
-            <w:bottom w:w="0" w:type="dxa"/>
-          </w:tblCellMar>
-        </w:tblPrEx>
         <w:tc>
           <w:tcPr>
             <w:tcW w:w="2400" w:type="dxa"/>
@@ -2737,12 +2581,6 @@
         </w:tc>
       </w:tr>
       <w:tr>
-        <w:tblPrEx>
-          <w:tblCellMar>
-            <w:top w:w="0" w:type="dxa"/>
-            <w:bottom w:w="0" w:type="dxa"/>
-          </w:tblCellMar>
-        </w:tblPrEx>
         <w:tc>
           <w:tcPr>
             <w:tcW w:w="2400" w:type="dxa"/>
@@ -2807,12 +2645,6 @@
         </w:tc>
       </w:tr>
       <w:tr>
-        <w:tblPrEx>
-          <w:tblCellMar>
-            <w:top w:w="0" w:type="dxa"/>
-            <w:bottom w:w="0" w:type="dxa"/>
-          </w:tblCellMar>
-        </w:tblPrEx>
         <w:tc>
           <w:tcPr>
             <w:tcW w:w="2400" w:type="dxa"/>
@@ -2886,12 +2718,6 @@
         </w:tc>
       </w:tr>
       <w:tr>
-        <w:tblPrEx>
-          <w:tblCellMar>
-            <w:top w:w="0" w:type="dxa"/>
-            <w:bottom w:w="0" w:type="dxa"/>
-          </w:tblCellMar>
-        </w:tblPrEx>
         <w:tc>
           <w:tcPr>
             <w:tcW w:w="2400" w:type="dxa"/>
@@ -2956,12 +2782,6 @@
         </w:tc>
       </w:tr>
       <w:tr>
-        <w:tblPrEx>
-          <w:tblCellMar>
-            <w:top w:w="0" w:type="dxa"/>
-            <w:bottom w:w="0" w:type="dxa"/>
-          </w:tblCellMar>
-        </w:tblPrEx>
         <w:tc>
           <w:tcPr>
             <w:tcW w:w="2400" w:type="dxa"/>
@@ -3059,12 +2879,6 @@
         </w:tc>
       </w:tr>
       <w:tr>
-        <w:tblPrEx>
-          <w:tblCellMar>
-            <w:top w:w="0" w:type="dxa"/>
-            <w:bottom w:w="0" w:type="dxa"/>
-          </w:tblCellMar>
-        </w:tblPrEx>
         <w:tc>
           <w:tcPr>
             <w:tcW w:w="2400" w:type="dxa"/>
@@ -3146,12 +2960,6 @@
         </w:tc>
       </w:tr>
       <w:tr>
-        <w:tblPrEx>
-          <w:tblCellMar>
-            <w:top w:w="0" w:type="dxa"/>
-            <w:bottom w:w="0" w:type="dxa"/>
-          </w:tblCellMar>
-        </w:tblPrEx>
         <w:tc>
           <w:tcPr>
             <w:tcW w:w="2400" w:type="dxa"/>
@@ -3274,12 +3082,6 @@
         <w:gridCol w:w="6960"/>
       </w:tblGrid>
       <w:tr>
-        <w:tblPrEx>
-          <w:tblCellMar>
-            <w:top w:w="0" w:type="dxa"/>
-            <w:bottom w:w="0" w:type="dxa"/>
-          </w:tblCellMar>
-        </w:tblPrEx>
         <w:trPr>
           <w:tblHeader/>
         </w:trPr>
@@ -3355,12 +3157,6 @@
         </w:tc>
       </w:tr>
       <w:tr>
-        <w:tblPrEx>
-          <w:tblCellMar>
-            <w:top w:w="0" w:type="dxa"/>
-            <w:bottom w:w="0" w:type="dxa"/>
-          </w:tblCellMar>
-        </w:tblPrEx>
         <w:tc>
           <w:tcPr>
             <w:tcW w:w="2400" w:type="dxa"/>
@@ -3425,12 +3221,6 @@
         </w:tc>
       </w:tr>
       <w:tr>
-        <w:tblPrEx>
-          <w:tblCellMar>
-            <w:top w:w="0" w:type="dxa"/>
-            <w:bottom w:w="0" w:type="dxa"/>
-          </w:tblCellMar>
-        </w:tblPrEx>
         <w:tc>
           <w:tcPr>
             <w:tcW w:w="2400" w:type="dxa"/>
@@ -3502,12 +3292,6 @@
         </w:tc>
       </w:tr>
       <w:tr>
-        <w:tblPrEx>
-          <w:tblCellMar>
-            <w:top w:w="0" w:type="dxa"/>
-            <w:bottom w:w="0" w:type="dxa"/>
-          </w:tblCellMar>
-        </w:tblPrEx>
         <w:tc>
           <w:tcPr>
             <w:tcW w:w="2400" w:type="dxa"/>
@@ -3572,12 +3356,6 @@
         </w:tc>
       </w:tr>
       <w:tr>
-        <w:tblPrEx>
-          <w:tblCellMar>
-            <w:top w:w="0" w:type="dxa"/>
-            <w:bottom w:w="0" w:type="dxa"/>
-          </w:tblCellMar>
-        </w:tblPrEx>
         <w:tc>
           <w:tcPr>
             <w:tcW w:w="2400" w:type="dxa"/>
@@ -3651,12 +3429,6 @@
         </w:tc>
       </w:tr>
       <w:tr>
-        <w:tblPrEx>
-          <w:tblCellMar>
-            <w:top w:w="0" w:type="dxa"/>
-            <w:bottom w:w="0" w:type="dxa"/>
-          </w:tblCellMar>
-        </w:tblPrEx>
         <w:tc>
           <w:tcPr>
             <w:tcW w:w="2400" w:type="dxa"/>
@@ -3721,12 +3493,6 @@
         </w:tc>
       </w:tr>
       <w:tr>
-        <w:tblPrEx>
-          <w:tblCellMar>
-            <w:top w:w="0" w:type="dxa"/>
-            <w:bottom w:w="0" w:type="dxa"/>
-          </w:tblCellMar>
-        </w:tblPrEx>
         <w:tc>
           <w:tcPr>
             <w:tcW w:w="2400" w:type="dxa"/>
@@ -3883,12 +3649,6 @@
         </w:tc>
       </w:tr>
       <w:tr>
-        <w:tblPrEx>
-          <w:tblCellMar>
-            <w:top w:w="0" w:type="dxa"/>
-            <w:bottom w:w="0" w:type="dxa"/>
-          </w:tblCellMar>
-        </w:tblPrEx>
         <w:tc>
           <w:tcPr>
             <w:tcW w:w="2400" w:type="dxa"/>
@@ -3969,12 +3729,6 @@
         </w:tc>
       </w:tr>
       <w:tr>
-        <w:tblPrEx>
-          <w:tblCellMar>
-            <w:top w:w="0" w:type="dxa"/>
-            <w:bottom w:w="0" w:type="dxa"/>
-          </w:tblCellMar>
-        </w:tblPrEx>
         <w:tc>
           <w:tcPr>
             <w:tcW w:w="2400" w:type="dxa"/>
@@ -4097,12 +3851,6 @@
         <w:gridCol w:w="6960"/>
       </w:tblGrid>
       <w:tr>
-        <w:tblPrEx>
-          <w:tblCellMar>
-            <w:top w:w="0" w:type="dxa"/>
-            <w:bottom w:w="0" w:type="dxa"/>
-          </w:tblCellMar>
-        </w:tblPrEx>
         <w:trPr>
           <w:tblHeader/>
         </w:trPr>
@@ -4178,12 +3926,6 @@
         </w:tc>
       </w:tr>
       <w:tr>
-        <w:tblPrEx>
-          <w:tblCellMar>
-            <w:top w:w="0" w:type="dxa"/>
-            <w:bottom w:w="0" w:type="dxa"/>
-          </w:tblCellMar>
-        </w:tblPrEx>
         <w:tc>
           <w:tcPr>
             <w:tcW w:w="2400" w:type="dxa"/>
@@ -4248,12 +3990,6 @@
         </w:tc>
       </w:tr>
       <w:tr>
-        <w:tblPrEx>
-          <w:tblCellMar>
-            <w:top w:w="0" w:type="dxa"/>
-            <w:bottom w:w="0" w:type="dxa"/>
-          </w:tblCellMar>
-        </w:tblPrEx>
         <w:tc>
           <w:tcPr>
             <w:tcW w:w="2400" w:type="dxa"/>
@@ -4318,12 +4054,6 @@
         </w:tc>
       </w:tr>
       <w:tr>
-        <w:tblPrEx>
-          <w:tblCellMar>
-            <w:top w:w="0" w:type="dxa"/>
-            <w:bottom w:w="0" w:type="dxa"/>
-          </w:tblCellMar>
-        </w:tblPrEx>
         <w:tc>
           <w:tcPr>
             <w:tcW w:w="2400" w:type="dxa"/>
@@ -4388,12 +4118,6 @@
         </w:tc>
       </w:tr>
       <w:tr>
-        <w:tblPrEx>
-          <w:tblCellMar>
-            <w:top w:w="0" w:type="dxa"/>
-            <w:bottom w:w="0" w:type="dxa"/>
-          </w:tblCellMar>
-        </w:tblPrEx>
         <w:tc>
           <w:tcPr>
             <w:tcW w:w="2400" w:type="dxa"/>
@@ -4458,12 +4182,6 @@
         </w:tc>
       </w:tr>
       <w:tr>
-        <w:tblPrEx>
-          <w:tblCellMar>
-            <w:top w:w="0" w:type="dxa"/>
-            <w:bottom w:w="0" w:type="dxa"/>
-          </w:tblCellMar>
-        </w:tblPrEx>
         <w:tc>
           <w:tcPr>
             <w:tcW w:w="2400" w:type="dxa"/>
@@ -4528,12 +4246,6 @@
         </w:tc>
       </w:tr>
       <w:tr>
-        <w:tblPrEx>
-          <w:tblCellMar>
-            <w:top w:w="0" w:type="dxa"/>
-            <w:bottom w:w="0" w:type="dxa"/>
-          </w:tblCellMar>
-        </w:tblPrEx>
         <w:tc>
           <w:tcPr>
             <w:tcW w:w="2400" w:type="dxa"/>
@@ -4615,12 +4327,6 @@
         </w:tc>
       </w:tr>
       <w:tr>
-        <w:tblPrEx>
-          <w:tblCellMar>
-            <w:top w:w="0" w:type="dxa"/>
-            <w:bottom w:w="0" w:type="dxa"/>
-          </w:tblCellMar>
-        </w:tblPrEx>
         <w:tc>
           <w:tcPr>
             <w:tcW w:w="2400" w:type="dxa"/>
@@ -4685,12 +4391,6 @@
         </w:tc>
       </w:tr>
       <w:tr>
-        <w:tblPrEx>
-          <w:tblCellMar>
-            <w:top w:w="0" w:type="dxa"/>
-            <w:bottom w:w="0" w:type="dxa"/>
-          </w:tblCellMar>
-        </w:tblPrEx>
         <w:tc>
           <w:tcPr>
             <w:tcW w:w="2400" w:type="dxa"/>
@@ -4856,12 +4556,6 @@
         <w:gridCol w:w="1361"/>
       </w:tblGrid>
       <w:tr>
-        <w:tblPrEx>
-          <w:tblCellMar>
-            <w:top w:w="0" w:type="dxa"/>
-            <w:bottom w:w="0" w:type="dxa"/>
-          </w:tblCellMar>
-        </w:tblPrEx>
         <w:trPr>
           <w:tblHeader/>
         </w:trPr>
@@ -5042,12 +4736,6 @@
         </w:tc>
       </w:tr>
       <w:tr>
-        <w:tblPrEx>
-          <w:tblCellMar>
-            <w:top w:w="0" w:type="dxa"/>
-            <w:bottom w:w="0" w:type="dxa"/>
-          </w:tblCellMar>
-        </w:tblPrEx>
         <w:tc>
           <w:tcPr>
             <w:tcW w:w="1700" w:type="dxa"/>
@@ -5200,12 +4888,6 @@
         </w:tc>
       </w:tr>
       <w:tr>
-        <w:tblPrEx>
-          <w:tblCellMar>
-            <w:top w:w="0" w:type="dxa"/>
-            <w:bottom w:w="0" w:type="dxa"/>
-          </w:tblCellMar>
-        </w:tblPrEx>
         <w:tc>
           <w:tcPr>
             <w:tcW w:w="1700" w:type="dxa"/>
@@ -5358,12 +5040,6 @@
         </w:tc>
       </w:tr>
       <w:tr>
-        <w:tblPrEx>
-          <w:tblCellMar>
-            <w:top w:w="0" w:type="dxa"/>
-            <w:bottom w:w="0" w:type="dxa"/>
-          </w:tblCellMar>
-        </w:tblPrEx>
         <w:tc>
           <w:tcPr>
             <w:tcW w:w="1700" w:type="dxa"/>
@@ -5518,12 +5194,6 @@
         </w:tc>
       </w:tr>
       <w:tr>
-        <w:tblPrEx>
-          <w:tblCellMar>
-            <w:top w:w="0" w:type="dxa"/>
-            <w:bottom w:w="0" w:type="dxa"/>
-          </w:tblCellMar>
-        </w:tblPrEx>
         <w:tc>
           <w:tcPr>
             <w:tcW w:w="1700" w:type="dxa"/>
@@ -5687,12 +5357,6 @@
         </w:tc>
       </w:tr>
       <w:tr>
-        <w:tblPrEx>
-          <w:tblCellMar>
-            <w:top w:w="0" w:type="dxa"/>
-            <w:bottom w:w="0" w:type="dxa"/>
-          </w:tblCellMar>
-        </w:tblPrEx>
         <w:tc>
           <w:tcPr>
             <w:tcW w:w="1700" w:type="dxa"/>
@@ -5877,12 +5541,6 @@
         </w:tc>
       </w:tr>
       <w:tr>
-        <w:tblPrEx>
-          <w:tblCellMar>
-            <w:top w:w="0" w:type="dxa"/>
-            <w:bottom w:w="0" w:type="dxa"/>
-          </w:tblCellMar>
-        </w:tblPrEx>
         <w:tc>
           <w:tcPr>
             <w:tcW w:w="1700" w:type="dxa"/>
@@ -6035,12 +5693,6 @@
         </w:tc>
       </w:tr>
       <w:tr>
-        <w:tblPrEx>
-          <w:tblCellMar>
-            <w:top w:w="0" w:type="dxa"/>
-            <w:bottom w:w="0" w:type="dxa"/>
-          </w:tblCellMar>
-        </w:tblPrEx>
         <w:tc>
           <w:tcPr>
             <w:tcW w:w="1700" w:type="dxa"/>
@@ -7170,12 +6822,6 @@
         <w:gridCol w:w="5000"/>
       </w:tblGrid>
       <w:tr>
-        <w:tblPrEx>
-          <w:tblCellMar>
-            <w:top w:w="0" w:type="dxa"/>
-            <w:bottom w:w="0" w:type="dxa"/>
-          </w:tblCellMar>
-        </w:tblPrEx>
         <w:trPr>
           <w:tblHeader/>
         </w:trPr>
@@ -7251,12 +6897,6 @@
         </w:tc>
       </w:tr>
       <w:tr>
-        <w:tblPrEx>
-          <w:tblCellMar>
-            <w:top w:w="0" w:type="dxa"/>
-            <w:bottom w:w="0" w:type="dxa"/>
-          </w:tblCellMar>
-        </w:tblPrEx>
         <w:tc>
           <w:tcPr>
             <w:tcW w:w="4360" w:type="dxa"/>
@@ -7321,12 +6961,6 @@
         </w:tc>
       </w:tr>
       <w:tr>
-        <w:tblPrEx>
-          <w:tblCellMar>
-            <w:top w:w="0" w:type="dxa"/>
-            <w:bottom w:w="0" w:type="dxa"/>
-          </w:tblCellMar>
-        </w:tblPrEx>
         <w:tc>
           <w:tcPr>
             <w:tcW w:w="4360" w:type="dxa"/>
@@ -7391,12 +7025,6 @@
         </w:tc>
       </w:tr>
       <w:tr>
-        <w:tblPrEx>
-          <w:tblCellMar>
-            <w:top w:w="0" w:type="dxa"/>
-            <w:bottom w:w="0" w:type="dxa"/>
-          </w:tblCellMar>
-        </w:tblPrEx>
         <w:tc>
           <w:tcPr>
             <w:tcW w:w="4360" w:type="dxa"/>
@@ -7462,12 +7090,6 @@
         </w:tc>
       </w:tr>
       <w:tr>
-        <w:tblPrEx>
-          <w:tblCellMar>
-            <w:top w:w="0" w:type="dxa"/>
-            <w:bottom w:w="0" w:type="dxa"/>
-          </w:tblCellMar>
-        </w:tblPrEx>
         <w:tc>
           <w:tcPr>
             <w:tcW w:w="4360" w:type="dxa"/>
@@ -7532,12 +7154,6 @@
         </w:tc>
       </w:tr>
       <w:tr>
-        <w:tblPrEx>
-          <w:tblCellMar>
-            <w:top w:w="0" w:type="dxa"/>
-            <w:bottom w:w="0" w:type="dxa"/>
-          </w:tblCellMar>
-        </w:tblPrEx>
         <w:tc>
           <w:tcPr>
             <w:tcW w:w="4360" w:type="dxa"/>
@@ -7602,12 +7218,6 @@
         </w:tc>
       </w:tr>
       <w:tr>
-        <w:tblPrEx>
-          <w:tblCellMar>
-            <w:top w:w="0" w:type="dxa"/>
-            <w:bottom w:w="0" w:type="dxa"/>
-          </w:tblCellMar>
-        </w:tblPrEx>
         <w:tc>
           <w:tcPr>
             <w:tcW w:w="4360" w:type="dxa"/>
@@ -7672,12 +7282,6 @@
         </w:tc>
       </w:tr>
       <w:tr>
-        <w:tblPrEx>
-          <w:tblCellMar>
-            <w:top w:w="0" w:type="dxa"/>
-            <w:bottom w:w="0" w:type="dxa"/>
-          </w:tblCellMar>
-        </w:tblPrEx>
         <w:tc>
           <w:tcPr>
             <w:tcW w:w="4360" w:type="dxa"/>
@@ -7742,12 +7346,6 @@
         </w:tc>
       </w:tr>
       <w:tr>
-        <w:tblPrEx>
-          <w:tblCellMar>
-            <w:top w:w="0" w:type="dxa"/>
-            <w:bottom w:w="0" w:type="dxa"/>
-          </w:tblCellMar>
-        </w:tblPrEx>
         <w:tc>
           <w:tcPr>
             <w:tcW w:w="4360" w:type="dxa"/>
@@ -8060,6 +7658,9 @@
         <w:jc w:val="center"/>
       </w:pPr>
       <w:r>
+        <w:rPr>
+          <w:noProof/>
+        </w:rPr>
         <w:drawing>
           <wp:inline distT="0" distB="0" distL="0" distR="0" wp14:anchorId="59BE4B1B" wp14:editId="745438BA">
             <wp:extent cx="5943600" cy="3332480"/>
@@ -8236,12 +7837,6 @@
         <w:gridCol w:w="3200"/>
       </w:tblGrid>
       <w:tr>
-        <w:tblPrEx>
-          <w:tblCellMar>
-            <w:top w:w="0" w:type="dxa"/>
-            <w:bottom w:w="0" w:type="dxa"/>
-          </w:tblCellMar>
-        </w:tblPrEx>
         <w:trPr>
           <w:tblHeader/>
         </w:trPr>
@@ -8352,12 +7947,6 @@
         </w:tc>
       </w:tr>
       <w:tr>
-        <w:tblPrEx>
-          <w:tblCellMar>
-            <w:top w:w="0" w:type="dxa"/>
-            <w:bottom w:w="0" w:type="dxa"/>
-          </w:tblCellMar>
-        </w:tblPrEx>
         <w:tc>
           <w:tcPr>
             <w:tcW w:w="2400" w:type="dxa"/>
@@ -8477,12 +8066,6 @@
         </w:tc>
       </w:tr>
       <w:tr>
-        <w:tblPrEx>
-          <w:tblCellMar>
-            <w:top w:w="0" w:type="dxa"/>
-            <w:bottom w:w="0" w:type="dxa"/>
-          </w:tblCellMar>
-        </w:tblPrEx>
         <w:tc>
           <w:tcPr>
             <w:tcW w:w="2400" w:type="dxa"/>
@@ -8602,12 +8185,6 @@
         </w:tc>
       </w:tr>
       <w:tr>
-        <w:tblPrEx>
-          <w:tblCellMar>
-            <w:top w:w="0" w:type="dxa"/>
-            <w:bottom w:w="0" w:type="dxa"/>
-          </w:tblCellMar>
-        </w:tblPrEx>
         <w:tc>
           <w:tcPr>
             <w:tcW w:w="2400" w:type="dxa"/>
@@ -8702,12 +8279,6 @@
         </w:tc>
       </w:tr>
       <w:tr>
-        <w:tblPrEx>
-          <w:tblCellMar>
-            <w:top w:w="0" w:type="dxa"/>
-            <w:bottom w:w="0" w:type="dxa"/>
-          </w:tblCellMar>
-        </w:tblPrEx>
         <w:tc>
           <w:tcPr>
             <w:tcW w:w="2400" w:type="dxa"/>
@@ -8802,12 +8373,6 @@
         </w:tc>
       </w:tr>
       <w:tr>
-        <w:tblPrEx>
-          <w:tblCellMar>
-            <w:top w:w="0" w:type="dxa"/>
-            <w:bottom w:w="0" w:type="dxa"/>
-          </w:tblCellMar>
-        </w:tblPrEx>
         <w:tc>
           <w:tcPr>
             <w:tcW w:w="2400" w:type="dxa"/>
@@ -8920,12 +8485,6 @@
         </w:tc>
       </w:tr>
       <w:tr>
-        <w:tblPrEx>
-          <w:tblCellMar>
-            <w:top w:w="0" w:type="dxa"/>
-            <w:bottom w:w="0" w:type="dxa"/>
-          </w:tblCellMar>
-        </w:tblPrEx>
         <w:tc>
           <w:tcPr>
             <w:tcW w:w="2400" w:type="dxa"/>
@@ -9022,12 +8581,6 @@
         </w:tc>
       </w:tr>
       <w:tr>
-        <w:tblPrEx>
-          <w:tblCellMar>
-            <w:top w:w="0" w:type="dxa"/>
-            <w:bottom w:w="0" w:type="dxa"/>
-          </w:tblCellMar>
-        </w:tblPrEx>
         <w:tc>
           <w:tcPr>
             <w:tcW w:w="2400" w:type="dxa"/>
@@ -9289,12 +8842,6 @@
         <w:gridCol w:w="2400"/>
       </w:tblGrid>
       <w:tr>
-        <w:tblPrEx>
-          <w:tblCellMar>
-            <w:top w:w="0" w:type="dxa"/>
-            <w:bottom w:w="0" w:type="dxa"/>
-          </w:tblCellMar>
-        </w:tblPrEx>
         <w:trPr>
           <w:tblHeader/>
         </w:trPr>
@@ -9405,12 +8952,6 @@
         </w:tc>
       </w:tr>
       <w:tr>
-        <w:tblPrEx>
-          <w:tblCellMar>
-            <w:top w:w="0" w:type="dxa"/>
-            <w:bottom w:w="0" w:type="dxa"/>
-          </w:tblCellMar>
-        </w:tblPrEx>
         <w:tc>
           <w:tcPr>
             <w:tcW w:w="2700" w:type="dxa"/>
@@ -9534,12 +9075,6 @@
         </w:tc>
       </w:tr>
       <w:tr>
-        <w:tblPrEx>
-          <w:tblCellMar>
-            <w:top w:w="0" w:type="dxa"/>
-            <w:bottom w:w="0" w:type="dxa"/>
-          </w:tblCellMar>
-        </w:tblPrEx>
         <w:tc>
           <w:tcPr>
             <w:tcW w:w="2700" w:type="dxa"/>
@@ -9636,12 +9171,6 @@
         </w:tc>
       </w:tr>
       <w:tr>
-        <w:tblPrEx>
-          <w:tblCellMar>
-            <w:top w:w="0" w:type="dxa"/>
-            <w:bottom w:w="0" w:type="dxa"/>
-          </w:tblCellMar>
-        </w:tblPrEx>
         <w:tc>
           <w:tcPr>
             <w:tcW w:w="2700" w:type="dxa"/>
@@ -9765,12 +9294,6 @@
         </w:tc>
       </w:tr>
       <w:tr>
-        <w:tblPrEx>
-          <w:tblCellMar>
-            <w:top w:w="0" w:type="dxa"/>
-            <w:bottom w:w="0" w:type="dxa"/>
-          </w:tblCellMar>
-        </w:tblPrEx>
         <w:tc>
           <w:tcPr>
             <w:tcW w:w="2700" w:type="dxa"/>
@@ -9866,12 +9389,6 @@
         </w:tc>
       </w:tr>
       <w:tr>
-        <w:tblPrEx>
-          <w:tblCellMar>
-            <w:top w:w="0" w:type="dxa"/>
-            <w:bottom w:w="0" w:type="dxa"/>
-          </w:tblCellMar>
-        </w:tblPrEx>
         <w:tc>
           <w:tcPr>
             <w:tcW w:w="2700" w:type="dxa"/>
@@ -10030,12 +9547,6 @@
         </w:tc>
       </w:tr>
       <w:tr>
-        <w:tblPrEx>
-          <w:tblCellMar>
-            <w:top w:w="0" w:type="dxa"/>
-            <w:bottom w:w="0" w:type="dxa"/>
-          </w:tblCellMar>
-        </w:tblPrEx>
         <w:tc>
           <w:tcPr>
             <w:tcW w:w="2700" w:type="dxa"/>
@@ -10189,12 +9700,6 @@
         </w:tc>
       </w:tr>
       <w:tr>
-        <w:tblPrEx>
-          <w:tblCellMar>
-            <w:top w:w="0" w:type="dxa"/>
-            <w:bottom w:w="0" w:type="dxa"/>
-          </w:tblCellMar>
-        </w:tblPrEx>
         <w:tc>
           <w:tcPr>
             <w:tcW w:w="2700" w:type="dxa"/>
@@ -10314,12 +9819,6 @@
         </w:tc>
       </w:tr>
       <w:tr>
-        <w:tblPrEx>
-          <w:tblCellMar>
-            <w:top w:w="0" w:type="dxa"/>
-            <w:bottom w:w="0" w:type="dxa"/>
-          </w:tblCellMar>
-        </w:tblPrEx>
         <w:tc>
           <w:tcPr>
             <w:tcW w:w="2700" w:type="dxa"/>
@@ -10448,12 +9947,6 @@
         </w:tc>
       </w:tr>
       <w:tr>
-        <w:tblPrEx>
-          <w:tblCellMar>
-            <w:top w:w="0" w:type="dxa"/>
-            <w:bottom w:w="0" w:type="dxa"/>
-          </w:tblCellMar>
-        </w:tblPrEx>
         <w:tc>
           <w:tcPr>
             <w:tcW w:w="2700" w:type="dxa"/>
@@ -10548,12 +10041,6 @@
         </w:tc>
       </w:tr>
       <w:tr>
-        <w:tblPrEx>
-          <w:tblCellMar>
-            <w:top w:w="0" w:type="dxa"/>
-            <w:bottom w:w="0" w:type="dxa"/>
-          </w:tblCellMar>
-        </w:tblPrEx>
         <w:tc>
           <w:tcPr>
             <w:tcW w:w="2700" w:type="dxa"/>
@@ -10724,12 +10211,6 @@
         <w:gridCol w:w="3200"/>
       </w:tblGrid>
       <w:tr>
-        <w:tblPrEx>
-          <w:tblCellMar>
-            <w:top w:w="0" w:type="dxa"/>
-            <w:bottom w:w="0" w:type="dxa"/>
-          </w:tblCellMar>
-        </w:tblPrEx>
         <w:trPr>
           <w:tblHeader/>
         </w:trPr>
@@ -10840,12 +10321,6 @@
         </w:tc>
       </w:tr>
       <w:tr>
-        <w:tblPrEx>
-          <w:tblCellMar>
-            <w:top w:w="0" w:type="dxa"/>
-            <w:bottom w:w="0" w:type="dxa"/>
-          </w:tblCellMar>
-        </w:tblPrEx>
         <w:tc>
           <w:tcPr>
             <w:tcW w:w="2700" w:type="dxa"/>
@@ -10972,12 +10447,6 @@
         </w:tc>
       </w:tr>
       <w:tr>
-        <w:tblPrEx>
-          <w:tblCellMar>
-            <w:top w:w="0" w:type="dxa"/>
-            <w:bottom w:w="0" w:type="dxa"/>
-          </w:tblCellMar>
-        </w:tblPrEx>
         <w:tc>
           <w:tcPr>
             <w:tcW w:w="2700" w:type="dxa"/>
@@ -11097,12 +10566,6 @@
         </w:tc>
       </w:tr>
       <w:tr>
-        <w:tblPrEx>
-          <w:tblCellMar>
-            <w:top w:w="0" w:type="dxa"/>
-            <w:bottom w:w="0" w:type="dxa"/>
-          </w:tblCellMar>
-        </w:tblPrEx>
         <w:tc>
           <w:tcPr>
             <w:tcW w:w="2700" w:type="dxa"/>
@@ -11222,12 +10685,6 @@
         </w:tc>
       </w:tr>
       <w:tr>
-        <w:tblPrEx>
-          <w:tblCellMar>
-            <w:top w:w="0" w:type="dxa"/>
-            <w:bottom w:w="0" w:type="dxa"/>
-          </w:tblCellMar>
-        </w:tblPrEx>
         <w:tc>
           <w:tcPr>
             <w:tcW w:w="2700" w:type="dxa"/>
@@ -11338,12 +10795,6 @@
         </w:tc>
       </w:tr>
       <w:tr>
-        <w:tblPrEx>
-          <w:tblCellMar>
-            <w:top w:w="0" w:type="dxa"/>
-            <w:bottom w:w="0" w:type="dxa"/>
-          </w:tblCellMar>
-        </w:tblPrEx>
         <w:tc>
           <w:tcPr>
             <w:tcW w:w="2700" w:type="dxa"/>
@@ -11518,12 +10969,6 @@
         </w:tc>
       </w:tr>
       <w:tr>
-        <w:tblPrEx>
-          <w:tblCellMar>
-            <w:top w:w="0" w:type="dxa"/>
-            <w:bottom w:w="0" w:type="dxa"/>
-          </w:tblCellMar>
-        </w:tblPrEx>
         <w:tc>
           <w:tcPr>
             <w:tcW w:w="2700" w:type="dxa"/>
@@ -12080,12 +11525,6 @@
         <w:gridCol w:w="2600"/>
       </w:tblGrid>
       <w:tr>
-        <w:tblPrEx>
-          <w:tblCellMar>
-            <w:top w:w="0" w:type="dxa"/>
-            <w:bottom w:w="0" w:type="dxa"/>
-          </w:tblCellMar>
-        </w:tblPrEx>
         <w:trPr>
           <w:tblHeader/>
         </w:trPr>
@@ -12210,12 +11649,6 @@
         </w:tc>
       </w:tr>
       <w:tr>
-        <w:tblPrEx>
-          <w:tblCellMar>
-            <w:top w:w="0" w:type="dxa"/>
-            <w:bottom w:w="0" w:type="dxa"/>
-          </w:tblCellMar>
-        </w:tblPrEx>
         <w:tc>
           <w:tcPr>
             <w:tcW w:w="2500" w:type="dxa"/>
@@ -12353,12 +11786,6 @@
         </w:tc>
       </w:tr>
       <w:tr>
-        <w:tblPrEx>
-          <w:tblCellMar>
-            <w:top w:w="0" w:type="dxa"/>
-            <w:bottom w:w="0" w:type="dxa"/>
-          </w:tblCellMar>
-        </w:tblPrEx>
         <w:tc>
           <w:tcPr>
             <w:tcW w:w="2500" w:type="dxa"/>
@@ -12481,12 +11908,6 @@
         </w:tc>
       </w:tr>
       <w:tr>
-        <w:tblPrEx>
-          <w:tblCellMar>
-            <w:top w:w="0" w:type="dxa"/>
-            <w:bottom w:w="0" w:type="dxa"/>
-          </w:tblCellMar>
-        </w:tblPrEx>
         <w:tc>
           <w:tcPr>
             <w:tcW w:w="2500" w:type="dxa"/>
@@ -12695,12 +12116,6 @@
         <w:gridCol w:w="2750"/>
       </w:tblGrid>
       <w:tr>
-        <w:tblPrEx>
-          <w:tblCellMar>
-            <w:top w:w="0" w:type="dxa"/>
-            <w:bottom w:w="0" w:type="dxa"/>
-          </w:tblCellMar>
-        </w:tblPrEx>
         <w:trPr>
           <w:tblHeader/>
         </w:trPr>
@@ -12811,12 +12226,6 @@
         </w:tc>
       </w:tr>
       <w:tr>
-        <w:tblPrEx>
-          <w:tblCellMar>
-            <w:top w:w="0" w:type="dxa"/>
-            <w:bottom w:w="0" w:type="dxa"/>
-          </w:tblCellMar>
-        </w:tblPrEx>
         <w:tc>
           <w:tcPr>
             <w:tcW w:w="2050" w:type="dxa"/>
@@ -12911,12 +12320,6 @@
         </w:tc>
       </w:tr>
       <w:tr>
-        <w:tblPrEx>
-          <w:tblCellMar>
-            <w:top w:w="0" w:type="dxa"/>
-            <w:bottom w:w="0" w:type="dxa"/>
-          </w:tblCellMar>
-        </w:tblPrEx>
         <w:tc>
           <w:tcPr>
             <w:tcW w:w="2050" w:type="dxa"/>
@@ -13011,12 +12414,6 @@
         </w:tc>
       </w:tr>
       <w:tr>
-        <w:tblPrEx>
-          <w:tblCellMar>
-            <w:top w:w="0" w:type="dxa"/>
-            <w:bottom w:w="0" w:type="dxa"/>
-          </w:tblCellMar>
-        </w:tblPrEx>
         <w:tc>
           <w:tcPr>
             <w:tcW w:w="2050" w:type="dxa"/>
@@ -13129,12 +12526,6 @@
         </w:tc>
       </w:tr>
       <w:tr>
-        <w:tblPrEx>
-          <w:tblCellMar>
-            <w:top w:w="0" w:type="dxa"/>
-            <w:bottom w:w="0" w:type="dxa"/>
-          </w:tblCellMar>
-        </w:tblPrEx>
         <w:tc>
           <w:tcPr>
             <w:tcW w:w="2050" w:type="dxa"/>
@@ -13229,12 +12620,6 @@
         </w:tc>
       </w:tr>
       <w:tr>
-        <w:tblPrEx>
-          <w:tblCellMar>
-            <w:top w:w="0" w:type="dxa"/>
-            <w:bottom w:w="0" w:type="dxa"/>
-          </w:tblCellMar>
-        </w:tblPrEx>
         <w:tc>
           <w:tcPr>
             <w:tcW w:w="2050" w:type="dxa"/>
@@ -13345,12 +12730,6 @@
         </w:tc>
       </w:tr>
       <w:tr>
-        <w:tblPrEx>
-          <w:tblCellMar>
-            <w:top w:w="0" w:type="dxa"/>
-            <w:bottom w:w="0" w:type="dxa"/>
-          </w:tblCellMar>
-        </w:tblPrEx>
         <w:tc>
           <w:tcPr>
             <w:tcW w:w="2050" w:type="dxa"/>
@@ -13582,12 +12961,6 @@
         <w:gridCol w:w="4700"/>
       </w:tblGrid>
       <w:tr>
-        <w:tblPrEx>
-          <w:tblCellMar>
-            <w:top w:w="0" w:type="dxa"/>
-            <w:bottom w:w="0" w:type="dxa"/>
-          </w:tblCellMar>
-        </w:tblPrEx>
         <w:trPr>
           <w:tblHeader/>
         </w:trPr>
@@ -13698,12 +13071,6 @@
         </w:tc>
       </w:tr>
       <w:tr>
-        <w:tblPrEx>
-          <w:tblCellMar>
-            <w:top w:w="0" w:type="dxa"/>
-            <w:bottom w:w="0" w:type="dxa"/>
-          </w:tblCellMar>
-        </w:tblPrEx>
         <w:tc>
           <w:tcPr>
             <w:tcW w:w="2400" w:type="dxa"/>
@@ -13800,12 +13167,6 @@
         </w:tc>
       </w:tr>
       <w:tr>
-        <w:tblPrEx>
-          <w:tblCellMar>
-            <w:top w:w="0" w:type="dxa"/>
-            <w:bottom w:w="0" w:type="dxa"/>
-          </w:tblCellMar>
-        </w:tblPrEx>
         <w:tc>
           <w:tcPr>
             <w:tcW w:w="2400" w:type="dxa"/>
@@ -13900,12 +13261,6 @@
         </w:tc>
       </w:tr>
       <w:tr>
-        <w:tblPrEx>
-          <w:tblCellMar>
-            <w:top w:w="0" w:type="dxa"/>
-            <w:bottom w:w="0" w:type="dxa"/>
-          </w:tblCellMar>
-        </w:tblPrEx>
         <w:tc>
           <w:tcPr>
             <w:tcW w:w="2400" w:type="dxa"/>
@@ -14016,12 +13371,6 @@
         </w:tc>
       </w:tr>
       <w:tr>
-        <w:tblPrEx>
-          <w:tblCellMar>
-            <w:top w:w="0" w:type="dxa"/>
-            <w:bottom w:w="0" w:type="dxa"/>
-          </w:tblCellMar>
-        </w:tblPrEx>
         <w:tc>
           <w:tcPr>
             <w:tcW w:w="2400" w:type="dxa"/>
@@ -14118,12 +13467,6 @@
         </w:tc>
       </w:tr>
       <w:tr>
-        <w:tblPrEx>
-          <w:tblCellMar>
-            <w:top w:w="0" w:type="dxa"/>
-            <w:bottom w:w="0" w:type="dxa"/>
-          </w:tblCellMar>
-        </w:tblPrEx>
         <w:tc>
           <w:tcPr>
             <w:tcW w:w="2400" w:type="dxa"/>
@@ -14595,6 +13938,9 @@
         <w:jc w:val="center"/>
       </w:pPr>
       <w:r>
+        <w:rPr>
+          <w:noProof/>
+        </w:rPr>
         <w:drawing>
           <wp:inline distT="0" distB="0" distL="0" distR="0" wp14:anchorId="0179918B" wp14:editId="2FD13426">
             <wp:extent cx="3504895" cy="4565350"/>
@@ -14772,12 +14118,6 @@
         <w:gridCol w:w="2760"/>
       </w:tblGrid>
       <w:tr>
-        <w:tblPrEx>
-          <w:tblCellMar>
-            <w:top w:w="0" w:type="dxa"/>
-            <w:bottom w:w="0" w:type="dxa"/>
-          </w:tblCellMar>
-        </w:tblPrEx>
         <w:trPr>
           <w:tblHeader/>
         </w:trPr>
@@ -14923,12 +14263,6 @@
         </w:tc>
       </w:tr>
       <w:tr>
-        <w:tblPrEx>
-          <w:tblCellMar>
-            <w:top w:w="0" w:type="dxa"/>
-            <w:bottom w:w="0" w:type="dxa"/>
-          </w:tblCellMar>
-        </w:tblPrEx>
         <w:tc>
           <w:tcPr>
             <w:tcW w:w="2700" w:type="dxa"/>
@@ -15053,12 +14387,6 @@
         </w:tc>
       </w:tr>
       <w:tr>
-        <w:tblPrEx>
-          <w:tblCellMar>
-            <w:top w:w="0" w:type="dxa"/>
-            <w:bottom w:w="0" w:type="dxa"/>
-          </w:tblCellMar>
-        </w:tblPrEx>
         <w:tc>
           <w:tcPr>
             <w:tcW w:w="2700" w:type="dxa"/>
@@ -15183,12 +14511,6 @@
         </w:tc>
       </w:tr>
       <w:tr>
-        <w:tblPrEx>
-          <w:tblCellMar>
-            <w:top w:w="0" w:type="dxa"/>
-            <w:bottom w:w="0" w:type="dxa"/>
-          </w:tblCellMar>
-        </w:tblPrEx>
         <w:tc>
           <w:tcPr>
             <w:tcW w:w="2700" w:type="dxa"/>
@@ -15313,12 +14635,6 @@
         </w:tc>
       </w:tr>
       <w:tr>
-        <w:tblPrEx>
-          <w:tblCellMar>
-            <w:top w:w="0" w:type="dxa"/>
-            <w:bottom w:w="0" w:type="dxa"/>
-          </w:tblCellMar>
-        </w:tblPrEx>
         <w:tc>
           <w:tcPr>
             <w:tcW w:w="2700" w:type="dxa"/>
@@ -15443,12 +14759,6 @@
         </w:tc>
       </w:tr>
       <w:tr>
-        <w:tblPrEx>
-          <w:tblCellMar>
-            <w:top w:w="0" w:type="dxa"/>
-            <w:bottom w:w="0" w:type="dxa"/>
-          </w:tblCellMar>
-        </w:tblPrEx>
         <w:tc>
           <w:tcPr>
             <w:tcW w:w="2700" w:type="dxa"/>
@@ -15573,12 +14883,6 @@
         </w:tc>
       </w:tr>
       <w:tr>
-        <w:tblPrEx>
-          <w:tblCellMar>
-            <w:top w:w="0" w:type="dxa"/>
-            <w:bottom w:w="0" w:type="dxa"/>
-          </w:tblCellMar>
-        </w:tblPrEx>
         <w:tc>
           <w:tcPr>
             <w:tcW w:w="2700" w:type="dxa"/>
@@ -15703,12 +15007,6 @@
         </w:tc>
       </w:tr>
       <w:tr>
-        <w:tblPrEx>
-          <w:tblCellMar>
-            <w:top w:w="0" w:type="dxa"/>
-            <w:bottom w:w="0" w:type="dxa"/>
-          </w:tblCellMar>
-        </w:tblPrEx>
         <w:tc>
           <w:tcPr>
             <w:tcW w:w="2700" w:type="dxa"/>
@@ -15936,12 +15234,6 @@
         <w:gridCol w:w="5700"/>
       </w:tblGrid>
       <w:tr>
-        <w:tblPrEx>
-          <w:tblCellMar>
-            <w:top w:w="0" w:type="dxa"/>
-            <w:bottom w:w="0" w:type="dxa"/>
-          </w:tblCellMar>
-        </w:tblPrEx>
         <w:trPr>
           <w:tblHeader/>
         </w:trPr>
@@ -16018,12 +15310,6 @@
         </w:tc>
       </w:tr>
       <w:tr>
-        <w:tblPrEx>
-          <w:tblCellMar>
-            <w:top w:w="0" w:type="dxa"/>
-            <w:bottom w:w="0" w:type="dxa"/>
-          </w:tblCellMar>
-        </w:tblPrEx>
         <w:tc>
           <w:tcPr>
             <w:tcW w:w="3660" w:type="dxa"/>
@@ -16139,12 +15425,6 @@
         </w:tc>
       </w:tr>
       <w:tr>
-        <w:tblPrEx>
-          <w:tblCellMar>
-            <w:top w:w="0" w:type="dxa"/>
-            <w:bottom w:w="0" w:type="dxa"/>
-          </w:tblCellMar>
-        </w:tblPrEx>
         <w:tc>
           <w:tcPr>
             <w:tcW w:w="3660" w:type="dxa"/>
@@ -16236,12 +15516,6 @@
         </w:tc>
       </w:tr>
       <w:tr>
-        <w:tblPrEx>
-          <w:tblCellMar>
-            <w:top w:w="0" w:type="dxa"/>
-            <w:bottom w:w="0" w:type="dxa"/>
-          </w:tblCellMar>
-        </w:tblPrEx>
         <w:tc>
           <w:tcPr>
             <w:tcW w:w="3660" w:type="dxa"/>
@@ -16326,12 +15600,6 @@
         </w:tc>
       </w:tr>
       <w:tr>
-        <w:tblPrEx>
-          <w:tblCellMar>
-            <w:top w:w="0" w:type="dxa"/>
-            <w:bottom w:w="0" w:type="dxa"/>
-          </w:tblCellMar>
-        </w:tblPrEx>
         <w:tc>
           <w:tcPr>
             <w:tcW w:w="3660" w:type="dxa"/>
@@ -16396,12 +15664,6 @@
         </w:tc>
       </w:tr>
       <w:tr>
-        <w:tblPrEx>
-          <w:tblCellMar>
-            <w:top w:w="0" w:type="dxa"/>
-            <w:bottom w:w="0" w:type="dxa"/>
-          </w:tblCellMar>
-        </w:tblPrEx>
         <w:tc>
           <w:tcPr>
             <w:tcW w:w="3660" w:type="dxa"/>
@@ -16498,12 +15760,6 @@
         </w:tc>
       </w:tr>
       <w:tr>
-        <w:tblPrEx>
-          <w:tblCellMar>
-            <w:top w:w="0" w:type="dxa"/>
-            <w:bottom w:w="0" w:type="dxa"/>
-          </w:tblCellMar>
-        </w:tblPrEx>
         <w:tc>
           <w:tcPr>
             <w:tcW w:w="3660" w:type="dxa"/>
@@ -16568,12 +15824,6 @@
         </w:tc>
       </w:tr>
       <w:tr>
-        <w:tblPrEx>
-          <w:tblCellMar>
-            <w:top w:w="0" w:type="dxa"/>
-            <w:bottom w:w="0" w:type="dxa"/>
-          </w:tblCellMar>
-        </w:tblPrEx>
         <w:tc>
           <w:tcPr>
             <w:tcW w:w="3660" w:type="dxa"/>
@@ -16639,6 +15889,1483 @@
       </w:tr>
     </w:tbl>
     <w:p/>
+    <w:p/>
+    <w:p/>
+    <w:p>
+      <w:pPr>
+        <w:rPr>
+          <w:b/>
+          <w:bCs/>
+          <w:sz w:val="32"/>
+          <w:szCs w:val="32"/>
+        </w:rPr>
+      </w:pPr>
+      <w:r>
+        <w:rPr>
+          <w:b/>
+          <w:bCs/>
+          <w:sz w:val="32"/>
+          <w:szCs w:val="32"/>
+        </w:rPr>
+        <w:t>Fuentes ingeridas</w:t>
+      </w:r>
+    </w:p>
+    <w:p/>
+    <w:tbl>
+      <w:tblPr>
+        <w:tblW w:w="0" w:type="auto"/>
+        <w:tblBorders>
+          <w:top w:val="single" w:sz="4" w:space="0" w:color="auto"/>
+          <w:left w:val="single" w:sz="4" w:space="0" w:color="auto"/>
+          <w:bottom w:val="single" w:sz="4" w:space="0" w:color="auto"/>
+          <w:right w:val="single" w:sz="4" w:space="0" w:color="auto"/>
+        </w:tblBorders>
+        <w:shd w:val="clear" w:color="auto" w:fill="21222C"/>
+        <w:tblCellMar>
+          <w:top w:w="15" w:type="dxa"/>
+          <w:left w:w="15" w:type="dxa"/>
+          <w:bottom w:w="15" w:type="dxa"/>
+          <w:right w:w="15" w:type="dxa"/>
+        </w:tblCellMar>
+        <w:tblLook w:val="04A0" w:firstRow="1" w:lastRow="0" w:firstColumn="1" w:lastColumn="0" w:noHBand="0" w:noVBand="1"/>
+      </w:tblPr>
+      <w:tblGrid>
+        <w:gridCol w:w="1246"/>
+        <w:gridCol w:w="4829"/>
+        <w:gridCol w:w="1514"/>
+      </w:tblGrid>
+      <w:tr>
+        <w:trPr>
+          <w:tblHeader/>
+        </w:trPr>
+        <w:tc>
+          <w:tcPr>
+            <w:tcW w:w="0" w:type="auto"/>
+            <w:tcBorders>
+              <w:top w:val="single" w:sz="4" w:space="0" w:color="auto"/>
+              <w:left w:val="single" w:sz="4" w:space="0" w:color="auto"/>
+              <w:bottom w:val="single" w:sz="4" w:space="0" w:color="auto"/>
+              <w:right w:val="single" w:sz="4" w:space="0" w:color="auto"/>
+            </w:tcBorders>
+            <w:shd w:val="clear" w:color="auto" w:fill="21222C"/>
+            <w:tcMar>
+              <w:top w:w="30" w:type="dxa"/>
+              <w:left w:w="30" w:type="dxa"/>
+              <w:bottom w:w="30" w:type="dxa"/>
+              <w:right w:w="30" w:type="dxa"/>
+            </w:tcMar>
+            <w:vAlign w:val="center"/>
+            <w:hideMark/>
+          </w:tcPr>
+          <w:p>
+            <w:pPr>
+              <w:spacing w:after="160" w:line="259" w:lineRule="auto"/>
+              <w:rPr>
+                <w:rFonts w:ascii="Aptos" w:eastAsia="Aptos" w:hAnsi="Aptos"/>
+                <w:b/>
+                <w:bCs/>
+                <w:color w:val="auto"/>
+                <w:kern w:val="2"/>
+                <w:sz w:val="22"/>
+                <w:szCs w:val="22"/>
+                <w:lang w:eastAsia="en-US"/>
+                <w14:ligatures w14:val="standardContextual"/>
+              </w:rPr>
+            </w:pPr>
+            <w:r>
+              <w:rPr>
+                <w:rFonts w:ascii="Aptos" w:eastAsia="Aptos" w:hAnsi="Aptos"/>
+                <w:b/>
+                <w:bCs/>
+                <w:color w:val="auto"/>
+                <w:kern w:val="2"/>
+                <w:sz w:val="22"/>
+                <w:szCs w:val="22"/>
+                <w:lang w:eastAsia="en-US"/>
+                <w14:ligatures w14:val="standardContextual"/>
+              </w:rPr>
+              <w:t>Fragmentos</w:t>
+            </w:r>
+          </w:p>
+        </w:tc>
+        <w:tc>
+          <w:tcPr>
+            <w:tcW w:w="0" w:type="auto"/>
+            <w:tcBorders>
+              <w:top w:val="single" w:sz="4" w:space="0" w:color="auto"/>
+              <w:left w:val="single" w:sz="4" w:space="0" w:color="auto"/>
+              <w:bottom w:val="single" w:sz="4" w:space="0" w:color="auto"/>
+              <w:right w:val="single" w:sz="4" w:space="0" w:color="auto"/>
+            </w:tcBorders>
+            <w:shd w:val="clear" w:color="auto" w:fill="21222C"/>
+            <w:tcMar>
+              <w:top w:w="30" w:type="dxa"/>
+              <w:left w:w="30" w:type="dxa"/>
+              <w:bottom w:w="30" w:type="dxa"/>
+              <w:right w:w="30" w:type="dxa"/>
+            </w:tcMar>
+            <w:vAlign w:val="center"/>
+            <w:hideMark/>
+          </w:tcPr>
+          <w:p>
+            <w:pPr>
+              <w:spacing w:after="160" w:line="259" w:lineRule="auto"/>
+              <w:rPr>
+                <w:rFonts w:ascii="Aptos" w:eastAsia="Aptos" w:hAnsi="Aptos"/>
+                <w:b/>
+                <w:bCs/>
+                <w:color w:val="auto"/>
+                <w:kern w:val="2"/>
+                <w:sz w:val="22"/>
+                <w:szCs w:val="22"/>
+                <w:lang w:eastAsia="en-US"/>
+                <w14:ligatures w14:val="standardContextual"/>
+              </w:rPr>
+            </w:pPr>
+            <w:r>
+              <w:rPr>
+                <w:rFonts w:ascii="Aptos" w:eastAsia="Aptos" w:hAnsi="Aptos"/>
+                <w:b/>
+                <w:bCs/>
+                <w:color w:val="auto"/>
+                <w:kern w:val="2"/>
+                <w:sz w:val="22"/>
+                <w:szCs w:val="22"/>
+                <w:lang w:eastAsia="en-US"/>
+                <w14:ligatures w14:val="standardContextual"/>
+              </w:rPr>
+              <w:t>Documento</w:t>
+            </w:r>
+          </w:p>
+        </w:tc>
+        <w:tc>
+          <w:tcPr>
+            <w:tcW w:w="0" w:type="auto"/>
+            <w:tcBorders>
+              <w:top w:val="single" w:sz="4" w:space="0" w:color="auto"/>
+              <w:left w:val="single" w:sz="4" w:space="0" w:color="auto"/>
+              <w:bottom w:val="single" w:sz="4" w:space="0" w:color="auto"/>
+              <w:right w:val="single" w:sz="4" w:space="0" w:color="auto"/>
+            </w:tcBorders>
+            <w:shd w:val="clear" w:color="auto" w:fill="21222C"/>
+            <w:tcMar>
+              <w:top w:w="30" w:type="dxa"/>
+              <w:left w:w="30" w:type="dxa"/>
+              <w:bottom w:w="30" w:type="dxa"/>
+              <w:right w:w="30" w:type="dxa"/>
+            </w:tcMar>
+            <w:vAlign w:val="center"/>
+            <w:hideMark/>
+          </w:tcPr>
+          <w:p>
+            <w:pPr>
+              <w:spacing w:after="160" w:line="259" w:lineRule="auto"/>
+              <w:rPr>
+                <w:rFonts w:ascii="Aptos" w:eastAsia="Aptos" w:hAnsi="Aptos"/>
+                <w:b/>
+                <w:bCs/>
+                <w:color w:val="auto"/>
+                <w:kern w:val="2"/>
+                <w:sz w:val="22"/>
+                <w:szCs w:val="22"/>
+                <w:lang w:eastAsia="en-US"/>
+                <w14:ligatures w14:val="standardContextual"/>
+              </w:rPr>
+            </w:pPr>
+            <w:r>
+              <w:rPr>
+                <w:rFonts w:ascii="Aptos" w:eastAsia="Aptos" w:hAnsi="Aptos"/>
+                <w:b/>
+                <w:bCs/>
+                <w:color w:val="auto"/>
+                <w:kern w:val="2"/>
+                <w:sz w:val="22"/>
+                <w:szCs w:val="22"/>
+                <w:lang w:eastAsia="en-US"/>
+                <w14:ligatures w14:val="standardContextual"/>
+              </w:rPr>
+              <w:t>Entidad</w:t>
+            </w:r>
+          </w:p>
+        </w:tc>
+      </w:tr>
+      <w:tr>
+        <w:tc>
+          <w:tcPr>
+            <w:tcW w:w="0" w:type="auto"/>
+            <w:tcBorders>
+              <w:top w:val="single" w:sz="4" w:space="0" w:color="auto"/>
+              <w:left w:val="single" w:sz="4" w:space="0" w:color="auto"/>
+              <w:bottom w:val="single" w:sz="4" w:space="0" w:color="auto"/>
+              <w:right w:val="single" w:sz="4" w:space="0" w:color="auto"/>
+            </w:tcBorders>
+            <w:shd w:val="clear" w:color="auto" w:fill="21222C"/>
+            <w:tcMar>
+              <w:top w:w="30" w:type="dxa"/>
+              <w:left w:w="30" w:type="dxa"/>
+              <w:bottom w:w="30" w:type="dxa"/>
+              <w:right w:w="30" w:type="dxa"/>
+            </w:tcMar>
+            <w:vAlign w:val="center"/>
+            <w:hideMark/>
+          </w:tcPr>
+          <w:p>
+            <w:pPr>
+              <w:spacing w:after="160" w:line="259" w:lineRule="auto"/>
+              <w:rPr>
+                <w:rFonts w:ascii="Aptos" w:eastAsia="Aptos" w:hAnsi="Aptos"/>
+                <w:color w:val="auto"/>
+                <w:kern w:val="2"/>
+                <w:sz w:val="22"/>
+                <w:szCs w:val="22"/>
+                <w:lang w:eastAsia="en-US"/>
+                <w14:ligatures w14:val="standardContextual"/>
+              </w:rPr>
+            </w:pPr>
+            <w:r>
+              <w:rPr>
+                <w:rFonts w:ascii="Aptos" w:eastAsia="Aptos" w:hAnsi="Aptos"/>
+                <w:color w:val="auto"/>
+                <w:kern w:val="2"/>
+                <w:sz w:val="22"/>
+                <w:szCs w:val="22"/>
+                <w:lang w:eastAsia="en-US"/>
+                <w14:ligatures w14:val="standardContextual"/>
+              </w:rPr>
+              <w:t>220</w:t>
+            </w:r>
+          </w:p>
+        </w:tc>
+        <w:tc>
+          <w:tcPr>
+            <w:tcW w:w="0" w:type="auto"/>
+            <w:tcBorders>
+              <w:top w:val="single" w:sz="4" w:space="0" w:color="auto"/>
+              <w:left w:val="single" w:sz="4" w:space="0" w:color="auto"/>
+              <w:bottom w:val="single" w:sz="4" w:space="0" w:color="auto"/>
+              <w:right w:val="single" w:sz="4" w:space="0" w:color="auto"/>
+            </w:tcBorders>
+            <w:shd w:val="clear" w:color="auto" w:fill="21222C"/>
+            <w:tcMar>
+              <w:top w:w="30" w:type="dxa"/>
+              <w:left w:w="30" w:type="dxa"/>
+              <w:bottom w:w="30" w:type="dxa"/>
+              <w:right w:w="30" w:type="dxa"/>
+            </w:tcMar>
+            <w:vAlign w:val="center"/>
+            <w:hideMark/>
+          </w:tcPr>
+          <w:p>
+            <w:pPr>
+              <w:spacing w:after="160" w:line="259" w:lineRule="auto"/>
+              <w:rPr>
+                <w:rFonts w:ascii="Aptos" w:eastAsia="Aptos" w:hAnsi="Aptos"/>
+                <w:color w:val="auto"/>
+                <w:kern w:val="2"/>
+                <w:sz w:val="22"/>
+                <w:szCs w:val="22"/>
+                <w:lang w:eastAsia="en-US"/>
+                <w14:ligatures w14:val="standardContextual"/>
+              </w:rPr>
+            </w:pPr>
+            <w:r>
+              <w:rPr>
+                <w:rFonts w:ascii="Aptos" w:eastAsia="Aptos" w:hAnsi="Aptos"/>
+                <w:color w:val="auto"/>
+                <w:kern w:val="2"/>
+                <w:sz w:val="22"/>
+                <w:szCs w:val="22"/>
+                <w:lang w:eastAsia="en-US"/>
+                <w14:ligatures w14:val="standardContextual"/>
+              </w:rPr>
+              <w:t>Sembrando biodiversidad Vol. 1</w:t>
+            </w:r>
+          </w:p>
+        </w:tc>
+        <w:tc>
+          <w:tcPr>
+            <w:tcW w:w="0" w:type="auto"/>
+            <w:tcBorders>
+              <w:top w:val="single" w:sz="4" w:space="0" w:color="auto"/>
+              <w:left w:val="single" w:sz="4" w:space="0" w:color="auto"/>
+              <w:bottom w:val="single" w:sz="4" w:space="0" w:color="auto"/>
+              <w:right w:val="single" w:sz="4" w:space="0" w:color="auto"/>
+            </w:tcBorders>
+            <w:shd w:val="clear" w:color="auto" w:fill="21222C"/>
+            <w:tcMar>
+              <w:top w:w="30" w:type="dxa"/>
+              <w:left w:w="30" w:type="dxa"/>
+              <w:bottom w:w="30" w:type="dxa"/>
+              <w:right w:w="30" w:type="dxa"/>
+            </w:tcMar>
+            <w:vAlign w:val="center"/>
+            <w:hideMark/>
+          </w:tcPr>
+          <w:p>
+            <w:pPr>
+              <w:spacing w:after="160" w:line="259" w:lineRule="auto"/>
+              <w:rPr>
+                <w:rFonts w:ascii="Aptos" w:eastAsia="Aptos" w:hAnsi="Aptos"/>
+                <w:color w:val="auto"/>
+                <w:kern w:val="2"/>
+                <w:sz w:val="22"/>
+                <w:szCs w:val="22"/>
+                <w:lang w:eastAsia="en-US"/>
+                <w14:ligatures w14:val="standardContextual"/>
+              </w:rPr>
+            </w:pPr>
+            <w:r>
+              <w:rPr>
+                <w:rFonts w:ascii="Aptos" w:eastAsia="Aptos" w:hAnsi="Aptos"/>
+                <w:color w:val="auto"/>
+                <w:kern w:val="2"/>
+                <w:sz w:val="22"/>
+                <w:szCs w:val="22"/>
+                <w:lang w:eastAsia="en-US"/>
+                <w14:ligatures w14:val="standardContextual"/>
+              </w:rPr>
+              <w:t>Jardín Botánico</w:t>
+            </w:r>
+          </w:p>
+        </w:tc>
+      </w:tr>
+      <w:tr>
+        <w:tc>
+          <w:tcPr>
+            <w:tcW w:w="0" w:type="auto"/>
+            <w:tcBorders>
+              <w:top w:val="single" w:sz="4" w:space="0" w:color="auto"/>
+              <w:left w:val="single" w:sz="4" w:space="0" w:color="auto"/>
+              <w:bottom w:val="single" w:sz="4" w:space="0" w:color="auto"/>
+              <w:right w:val="single" w:sz="4" w:space="0" w:color="auto"/>
+            </w:tcBorders>
+            <w:shd w:val="clear" w:color="auto" w:fill="21222C"/>
+            <w:tcMar>
+              <w:top w:w="30" w:type="dxa"/>
+              <w:left w:w="30" w:type="dxa"/>
+              <w:bottom w:w="30" w:type="dxa"/>
+              <w:right w:w="30" w:type="dxa"/>
+            </w:tcMar>
+            <w:vAlign w:val="center"/>
+            <w:hideMark/>
+          </w:tcPr>
+          <w:p>
+            <w:pPr>
+              <w:spacing w:after="160" w:line="259" w:lineRule="auto"/>
+              <w:rPr>
+                <w:rFonts w:ascii="Aptos" w:eastAsia="Aptos" w:hAnsi="Aptos"/>
+                <w:color w:val="auto"/>
+                <w:kern w:val="2"/>
+                <w:sz w:val="22"/>
+                <w:szCs w:val="22"/>
+                <w:lang w:eastAsia="en-US"/>
+                <w14:ligatures w14:val="standardContextual"/>
+              </w:rPr>
+            </w:pPr>
+            <w:r>
+              <w:rPr>
+                <w:rFonts w:ascii="Aptos" w:eastAsia="Aptos" w:hAnsi="Aptos"/>
+                <w:color w:val="auto"/>
+                <w:kern w:val="2"/>
+                <w:sz w:val="22"/>
+                <w:szCs w:val="22"/>
+                <w:lang w:eastAsia="en-US"/>
+                <w14:ligatures w14:val="standardContextual"/>
+              </w:rPr>
+              <w:t>125</w:t>
+            </w:r>
+          </w:p>
+        </w:tc>
+        <w:tc>
+          <w:tcPr>
+            <w:tcW w:w="0" w:type="auto"/>
+            <w:tcBorders>
+              <w:top w:val="single" w:sz="4" w:space="0" w:color="auto"/>
+              <w:left w:val="single" w:sz="4" w:space="0" w:color="auto"/>
+              <w:bottom w:val="single" w:sz="4" w:space="0" w:color="auto"/>
+              <w:right w:val="single" w:sz="4" w:space="0" w:color="auto"/>
+            </w:tcBorders>
+            <w:shd w:val="clear" w:color="auto" w:fill="21222C"/>
+            <w:tcMar>
+              <w:top w:w="30" w:type="dxa"/>
+              <w:left w:w="30" w:type="dxa"/>
+              <w:bottom w:w="30" w:type="dxa"/>
+              <w:right w:w="30" w:type="dxa"/>
+            </w:tcMar>
+            <w:vAlign w:val="center"/>
+            <w:hideMark/>
+          </w:tcPr>
+          <w:p>
+            <w:pPr>
+              <w:spacing w:after="160" w:line="259" w:lineRule="auto"/>
+              <w:rPr>
+                <w:rFonts w:ascii="Aptos" w:eastAsia="Aptos" w:hAnsi="Aptos"/>
+                <w:color w:val="auto"/>
+                <w:kern w:val="2"/>
+                <w:sz w:val="22"/>
+                <w:szCs w:val="22"/>
+                <w:lang w:eastAsia="en-US"/>
+                <w14:ligatures w14:val="standardContextual"/>
+              </w:rPr>
+            </w:pPr>
+            <w:r>
+              <w:rPr>
+                <w:rFonts w:ascii="Aptos" w:eastAsia="Aptos" w:hAnsi="Aptos"/>
+                <w:color w:val="auto"/>
+                <w:kern w:val="2"/>
+                <w:sz w:val="22"/>
+                <w:szCs w:val="22"/>
+                <w:lang w:eastAsia="en-US"/>
+                <w14:ligatures w14:val="standardContextual"/>
+              </w:rPr>
+              <w:t>Catálogo de plantas usadas</w:t>
+            </w:r>
+          </w:p>
+        </w:tc>
+        <w:tc>
+          <w:tcPr>
+            <w:tcW w:w="0" w:type="auto"/>
+            <w:tcBorders>
+              <w:top w:val="single" w:sz="4" w:space="0" w:color="auto"/>
+              <w:left w:val="single" w:sz="4" w:space="0" w:color="auto"/>
+              <w:bottom w:val="single" w:sz="4" w:space="0" w:color="auto"/>
+              <w:right w:val="single" w:sz="4" w:space="0" w:color="auto"/>
+            </w:tcBorders>
+            <w:shd w:val="clear" w:color="auto" w:fill="21222C"/>
+            <w:tcMar>
+              <w:top w:w="30" w:type="dxa"/>
+              <w:left w:w="30" w:type="dxa"/>
+              <w:bottom w:w="30" w:type="dxa"/>
+              <w:right w:w="30" w:type="dxa"/>
+            </w:tcMar>
+            <w:vAlign w:val="center"/>
+            <w:hideMark/>
+          </w:tcPr>
+          <w:p>
+            <w:pPr>
+              <w:spacing w:after="160" w:line="259" w:lineRule="auto"/>
+              <w:rPr>
+                <w:rFonts w:ascii="Aptos" w:eastAsia="Aptos" w:hAnsi="Aptos"/>
+                <w:color w:val="auto"/>
+                <w:kern w:val="2"/>
+                <w:sz w:val="22"/>
+                <w:szCs w:val="22"/>
+                <w:lang w:eastAsia="en-US"/>
+                <w14:ligatures w14:val="standardContextual"/>
+              </w:rPr>
+            </w:pPr>
+            <w:r>
+              <w:rPr>
+                <w:rFonts w:ascii="Aptos" w:eastAsia="Aptos" w:hAnsi="Aptos"/>
+                <w:color w:val="auto"/>
+                <w:kern w:val="2"/>
+                <w:sz w:val="22"/>
+                <w:szCs w:val="22"/>
+                <w:lang w:eastAsia="en-US"/>
+                <w14:ligatures w14:val="standardContextual"/>
+              </w:rPr>
+              <w:t>Jardín Botánico</w:t>
+            </w:r>
+          </w:p>
+        </w:tc>
+      </w:tr>
+      <w:tr>
+        <w:tc>
+          <w:tcPr>
+            <w:tcW w:w="0" w:type="auto"/>
+            <w:tcBorders>
+              <w:top w:val="single" w:sz="4" w:space="0" w:color="auto"/>
+              <w:left w:val="single" w:sz="4" w:space="0" w:color="auto"/>
+              <w:bottom w:val="single" w:sz="4" w:space="0" w:color="auto"/>
+              <w:right w:val="single" w:sz="4" w:space="0" w:color="auto"/>
+            </w:tcBorders>
+            <w:shd w:val="clear" w:color="auto" w:fill="21222C"/>
+            <w:tcMar>
+              <w:top w:w="30" w:type="dxa"/>
+              <w:left w:w="30" w:type="dxa"/>
+              <w:bottom w:w="30" w:type="dxa"/>
+              <w:right w:w="30" w:type="dxa"/>
+            </w:tcMar>
+            <w:vAlign w:val="center"/>
+            <w:hideMark/>
+          </w:tcPr>
+          <w:p>
+            <w:pPr>
+              <w:spacing w:after="160" w:line="259" w:lineRule="auto"/>
+              <w:rPr>
+                <w:rFonts w:ascii="Aptos" w:eastAsia="Aptos" w:hAnsi="Aptos"/>
+                <w:color w:val="auto"/>
+                <w:kern w:val="2"/>
+                <w:sz w:val="22"/>
+                <w:szCs w:val="22"/>
+                <w:lang w:eastAsia="en-US"/>
+                <w14:ligatures w14:val="standardContextual"/>
+              </w:rPr>
+            </w:pPr>
+            <w:r>
+              <w:rPr>
+                <w:rFonts w:ascii="Aptos" w:eastAsia="Aptos" w:hAnsi="Aptos"/>
+                <w:b/>
+                <w:bCs/>
+                <w:color w:val="auto"/>
+                <w:kern w:val="2"/>
+                <w:sz w:val="22"/>
+                <w:szCs w:val="22"/>
+                <w:lang w:eastAsia="en-US"/>
+                <w14:ligatures w14:val="standardContextual"/>
+              </w:rPr>
+              <w:t>92</w:t>
+            </w:r>
+          </w:p>
+        </w:tc>
+        <w:tc>
+          <w:tcPr>
+            <w:tcW w:w="0" w:type="auto"/>
+            <w:tcBorders>
+              <w:top w:val="single" w:sz="4" w:space="0" w:color="auto"/>
+              <w:left w:val="single" w:sz="4" w:space="0" w:color="auto"/>
+              <w:bottom w:val="single" w:sz="4" w:space="0" w:color="auto"/>
+              <w:right w:val="single" w:sz="4" w:space="0" w:color="auto"/>
+            </w:tcBorders>
+            <w:shd w:val="clear" w:color="auto" w:fill="21222C"/>
+            <w:tcMar>
+              <w:top w:w="30" w:type="dxa"/>
+              <w:left w:w="30" w:type="dxa"/>
+              <w:bottom w:w="30" w:type="dxa"/>
+              <w:right w:w="30" w:type="dxa"/>
+            </w:tcMar>
+            <w:vAlign w:val="center"/>
+            <w:hideMark/>
+          </w:tcPr>
+          <w:p>
+            <w:pPr>
+              <w:spacing w:after="160" w:line="259" w:lineRule="auto"/>
+              <w:rPr>
+                <w:rFonts w:ascii="Aptos" w:eastAsia="Aptos" w:hAnsi="Aptos"/>
+                <w:color w:val="auto"/>
+                <w:kern w:val="2"/>
+                <w:sz w:val="22"/>
+                <w:szCs w:val="22"/>
+                <w:lang w:eastAsia="en-US"/>
+                <w14:ligatures w14:val="standardContextual"/>
+              </w:rPr>
+            </w:pPr>
+            <w:r>
+              <w:rPr>
+                <w:rFonts w:ascii="Aptos" w:eastAsia="Aptos" w:hAnsi="Aptos"/>
+                <w:b/>
+                <w:bCs/>
+                <w:color w:val="auto"/>
+                <w:kern w:val="2"/>
+                <w:sz w:val="22"/>
+                <w:szCs w:val="22"/>
+                <w:lang w:eastAsia="en-US"/>
+                <w14:ligatures w14:val="standardContextual"/>
+              </w:rPr>
+              <w:t>Producción agroecológica urbana-periurbana</w:t>
+            </w:r>
+          </w:p>
+        </w:tc>
+        <w:tc>
+          <w:tcPr>
+            <w:tcW w:w="0" w:type="auto"/>
+            <w:tcBorders>
+              <w:top w:val="single" w:sz="4" w:space="0" w:color="auto"/>
+              <w:left w:val="single" w:sz="4" w:space="0" w:color="auto"/>
+              <w:bottom w:val="single" w:sz="4" w:space="0" w:color="auto"/>
+              <w:right w:val="single" w:sz="4" w:space="0" w:color="auto"/>
+            </w:tcBorders>
+            <w:shd w:val="clear" w:color="auto" w:fill="21222C"/>
+            <w:tcMar>
+              <w:top w:w="30" w:type="dxa"/>
+              <w:left w:w="30" w:type="dxa"/>
+              <w:bottom w:w="30" w:type="dxa"/>
+              <w:right w:w="30" w:type="dxa"/>
+            </w:tcMar>
+            <w:vAlign w:val="center"/>
+            <w:hideMark/>
+          </w:tcPr>
+          <w:p>
+            <w:pPr>
+              <w:spacing w:after="160" w:line="259" w:lineRule="auto"/>
+              <w:rPr>
+                <w:rFonts w:ascii="Aptos" w:eastAsia="Aptos" w:hAnsi="Aptos"/>
+                <w:color w:val="auto"/>
+                <w:kern w:val="2"/>
+                <w:sz w:val="22"/>
+                <w:szCs w:val="22"/>
+                <w:lang w:eastAsia="en-US"/>
+                <w14:ligatures w14:val="standardContextual"/>
+              </w:rPr>
+            </w:pPr>
+            <w:r>
+              <w:rPr>
+                <w:rFonts w:ascii="Aptos" w:eastAsia="Aptos" w:hAnsi="Aptos"/>
+                <w:b/>
+                <w:bCs/>
+                <w:color w:val="auto"/>
+                <w:kern w:val="2"/>
+                <w:sz w:val="22"/>
+                <w:szCs w:val="22"/>
+                <w:lang w:eastAsia="en-US"/>
+                <w14:ligatures w14:val="standardContextual"/>
+              </w:rPr>
+              <w:t>UNAD</w:t>
+            </w:r>
+          </w:p>
+        </w:tc>
+      </w:tr>
+      <w:tr>
+        <w:tc>
+          <w:tcPr>
+            <w:tcW w:w="0" w:type="auto"/>
+            <w:tcBorders>
+              <w:top w:val="single" w:sz="4" w:space="0" w:color="auto"/>
+              <w:left w:val="single" w:sz="4" w:space="0" w:color="auto"/>
+              <w:bottom w:val="single" w:sz="4" w:space="0" w:color="auto"/>
+              <w:right w:val="single" w:sz="4" w:space="0" w:color="auto"/>
+            </w:tcBorders>
+            <w:shd w:val="clear" w:color="auto" w:fill="21222C"/>
+            <w:tcMar>
+              <w:top w:w="30" w:type="dxa"/>
+              <w:left w:w="30" w:type="dxa"/>
+              <w:bottom w:w="30" w:type="dxa"/>
+              <w:right w:w="30" w:type="dxa"/>
+            </w:tcMar>
+            <w:vAlign w:val="center"/>
+            <w:hideMark/>
+          </w:tcPr>
+          <w:p>
+            <w:pPr>
+              <w:spacing w:after="160" w:line="259" w:lineRule="auto"/>
+              <w:rPr>
+                <w:rFonts w:ascii="Aptos" w:eastAsia="Aptos" w:hAnsi="Aptos"/>
+                <w:color w:val="auto"/>
+                <w:kern w:val="2"/>
+                <w:sz w:val="22"/>
+                <w:szCs w:val="22"/>
+                <w:lang w:eastAsia="en-US"/>
+                <w14:ligatures w14:val="standardContextual"/>
+              </w:rPr>
+            </w:pPr>
+            <w:r>
+              <w:rPr>
+                <w:rFonts w:ascii="Aptos" w:eastAsia="Aptos" w:hAnsi="Aptos"/>
+                <w:color w:val="auto"/>
+                <w:kern w:val="2"/>
+                <w:sz w:val="22"/>
+                <w:szCs w:val="22"/>
+                <w:lang w:eastAsia="en-US"/>
+                <w14:ligatures w14:val="standardContextual"/>
+              </w:rPr>
+              <w:t>81</w:t>
+            </w:r>
+          </w:p>
+        </w:tc>
+        <w:tc>
+          <w:tcPr>
+            <w:tcW w:w="0" w:type="auto"/>
+            <w:tcBorders>
+              <w:top w:val="single" w:sz="4" w:space="0" w:color="auto"/>
+              <w:left w:val="single" w:sz="4" w:space="0" w:color="auto"/>
+              <w:bottom w:val="single" w:sz="4" w:space="0" w:color="auto"/>
+              <w:right w:val="single" w:sz="4" w:space="0" w:color="auto"/>
+            </w:tcBorders>
+            <w:shd w:val="clear" w:color="auto" w:fill="21222C"/>
+            <w:tcMar>
+              <w:top w:w="30" w:type="dxa"/>
+              <w:left w:w="30" w:type="dxa"/>
+              <w:bottom w:w="30" w:type="dxa"/>
+              <w:right w:w="30" w:type="dxa"/>
+            </w:tcMar>
+            <w:vAlign w:val="center"/>
+            <w:hideMark/>
+          </w:tcPr>
+          <w:p>
+            <w:pPr>
+              <w:spacing w:after="160" w:line="259" w:lineRule="auto"/>
+              <w:rPr>
+                <w:rFonts w:ascii="Aptos" w:eastAsia="Aptos" w:hAnsi="Aptos"/>
+                <w:color w:val="auto"/>
+                <w:kern w:val="2"/>
+                <w:sz w:val="22"/>
+                <w:szCs w:val="22"/>
+                <w:lang w:eastAsia="en-US"/>
+                <w14:ligatures w14:val="standardContextual"/>
+              </w:rPr>
+            </w:pPr>
+            <w:r>
+              <w:rPr>
+                <w:rFonts w:ascii="Aptos" w:eastAsia="Aptos" w:hAnsi="Aptos"/>
+                <w:color w:val="auto"/>
+                <w:kern w:val="2"/>
+                <w:sz w:val="22"/>
+                <w:szCs w:val="22"/>
+                <w:lang w:eastAsia="en-US"/>
+                <w14:ligatures w14:val="standardContextual"/>
+              </w:rPr>
+              <w:t>Pasos básicos para establecer y manejar tu huerta</w:t>
+            </w:r>
+          </w:p>
+        </w:tc>
+        <w:tc>
+          <w:tcPr>
+            <w:tcW w:w="0" w:type="auto"/>
+            <w:tcBorders>
+              <w:top w:val="single" w:sz="4" w:space="0" w:color="auto"/>
+              <w:left w:val="single" w:sz="4" w:space="0" w:color="auto"/>
+              <w:bottom w:val="single" w:sz="4" w:space="0" w:color="auto"/>
+              <w:right w:val="single" w:sz="4" w:space="0" w:color="auto"/>
+            </w:tcBorders>
+            <w:shd w:val="clear" w:color="auto" w:fill="21222C"/>
+            <w:tcMar>
+              <w:top w:w="30" w:type="dxa"/>
+              <w:left w:w="30" w:type="dxa"/>
+              <w:bottom w:w="30" w:type="dxa"/>
+              <w:right w:w="30" w:type="dxa"/>
+            </w:tcMar>
+            <w:vAlign w:val="center"/>
+            <w:hideMark/>
+          </w:tcPr>
+          <w:p>
+            <w:pPr>
+              <w:spacing w:after="160" w:line="259" w:lineRule="auto"/>
+              <w:rPr>
+                <w:rFonts w:ascii="Aptos" w:eastAsia="Aptos" w:hAnsi="Aptos"/>
+                <w:color w:val="auto"/>
+                <w:kern w:val="2"/>
+                <w:sz w:val="22"/>
+                <w:szCs w:val="22"/>
+                <w:lang w:eastAsia="en-US"/>
+                <w14:ligatures w14:val="standardContextual"/>
+              </w:rPr>
+            </w:pPr>
+            <w:r>
+              <w:rPr>
+                <w:rFonts w:ascii="Aptos" w:eastAsia="Aptos" w:hAnsi="Aptos"/>
+                <w:color w:val="auto"/>
+                <w:kern w:val="2"/>
+                <w:sz w:val="22"/>
+                <w:szCs w:val="22"/>
+                <w:lang w:eastAsia="en-US"/>
+                <w14:ligatures w14:val="standardContextual"/>
+              </w:rPr>
+              <w:t>Jardín Botánico</w:t>
+            </w:r>
+          </w:p>
+        </w:tc>
+      </w:tr>
+      <w:tr>
+        <w:tc>
+          <w:tcPr>
+            <w:tcW w:w="0" w:type="auto"/>
+            <w:tcBorders>
+              <w:top w:val="single" w:sz="4" w:space="0" w:color="auto"/>
+              <w:left w:val="single" w:sz="4" w:space="0" w:color="auto"/>
+              <w:bottom w:val="single" w:sz="4" w:space="0" w:color="auto"/>
+              <w:right w:val="single" w:sz="4" w:space="0" w:color="auto"/>
+            </w:tcBorders>
+            <w:shd w:val="clear" w:color="auto" w:fill="21222C"/>
+            <w:tcMar>
+              <w:top w:w="30" w:type="dxa"/>
+              <w:left w:w="30" w:type="dxa"/>
+              <w:bottom w:w="30" w:type="dxa"/>
+              <w:right w:w="30" w:type="dxa"/>
+            </w:tcMar>
+            <w:vAlign w:val="center"/>
+            <w:hideMark/>
+          </w:tcPr>
+          <w:p>
+            <w:pPr>
+              <w:spacing w:after="160" w:line="259" w:lineRule="auto"/>
+              <w:rPr>
+                <w:rFonts w:ascii="Aptos" w:eastAsia="Aptos" w:hAnsi="Aptos"/>
+                <w:color w:val="auto"/>
+                <w:kern w:val="2"/>
+                <w:sz w:val="22"/>
+                <w:szCs w:val="22"/>
+                <w:lang w:eastAsia="en-US"/>
+                <w14:ligatures w14:val="standardContextual"/>
+              </w:rPr>
+            </w:pPr>
+            <w:r>
+              <w:rPr>
+                <w:rFonts w:ascii="Aptos" w:eastAsia="Aptos" w:hAnsi="Aptos"/>
+                <w:b/>
+                <w:bCs/>
+                <w:color w:val="auto"/>
+                <w:kern w:val="2"/>
+                <w:sz w:val="22"/>
+                <w:szCs w:val="22"/>
+                <w:lang w:eastAsia="en-US"/>
+                <w14:ligatures w14:val="standardContextual"/>
+              </w:rPr>
+              <w:t>68</w:t>
+            </w:r>
+          </w:p>
+        </w:tc>
+        <w:tc>
+          <w:tcPr>
+            <w:tcW w:w="0" w:type="auto"/>
+            <w:tcBorders>
+              <w:top w:val="single" w:sz="4" w:space="0" w:color="auto"/>
+              <w:left w:val="single" w:sz="4" w:space="0" w:color="auto"/>
+              <w:bottom w:val="single" w:sz="4" w:space="0" w:color="auto"/>
+              <w:right w:val="single" w:sz="4" w:space="0" w:color="auto"/>
+            </w:tcBorders>
+            <w:shd w:val="clear" w:color="auto" w:fill="21222C"/>
+            <w:tcMar>
+              <w:top w:w="30" w:type="dxa"/>
+              <w:left w:w="30" w:type="dxa"/>
+              <w:bottom w:w="30" w:type="dxa"/>
+              <w:right w:w="30" w:type="dxa"/>
+            </w:tcMar>
+            <w:vAlign w:val="center"/>
+            <w:hideMark/>
+          </w:tcPr>
+          <w:p>
+            <w:pPr>
+              <w:spacing w:after="160" w:line="259" w:lineRule="auto"/>
+              <w:rPr>
+                <w:rFonts w:ascii="Aptos" w:eastAsia="Aptos" w:hAnsi="Aptos"/>
+                <w:color w:val="auto"/>
+                <w:kern w:val="2"/>
+                <w:sz w:val="22"/>
+                <w:szCs w:val="22"/>
+                <w:lang w:eastAsia="en-US"/>
+                <w14:ligatures w14:val="standardContextual"/>
+              </w:rPr>
+            </w:pPr>
+            <w:r>
+              <w:rPr>
+                <w:rFonts w:ascii="Aptos" w:eastAsia="Aptos" w:hAnsi="Aptos"/>
+                <w:b/>
+                <w:bCs/>
+                <w:color w:val="auto"/>
+                <w:kern w:val="2"/>
+                <w:sz w:val="22"/>
+                <w:szCs w:val="22"/>
+                <w:lang w:eastAsia="en-US"/>
+                <w14:ligatures w14:val="standardContextual"/>
+              </w:rPr>
+              <w:t>Manual de compostaje del agricultor</w:t>
+            </w:r>
+          </w:p>
+        </w:tc>
+        <w:tc>
+          <w:tcPr>
+            <w:tcW w:w="0" w:type="auto"/>
+            <w:tcBorders>
+              <w:top w:val="single" w:sz="4" w:space="0" w:color="auto"/>
+              <w:left w:val="single" w:sz="4" w:space="0" w:color="auto"/>
+              <w:bottom w:val="single" w:sz="4" w:space="0" w:color="auto"/>
+              <w:right w:val="single" w:sz="4" w:space="0" w:color="auto"/>
+            </w:tcBorders>
+            <w:shd w:val="clear" w:color="auto" w:fill="21222C"/>
+            <w:tcMar>
+              <w:top w:w="30" w:type="dxa"/>
+              <w:left w:w="30" w:type="dxa"/>
+              <w:bottom w:w="30" w:type="dxa"/>
+              <w:right w:w="30" w:type="dxa"/>
+            </w:tcMar>
+            <w:vAlign w:val="center"/>
+            <w:hideMark/>
+          </w:tcPr>
+          <w:p>
+            <w:pPr>
+              <w:spacing w:after="160" w:line="259" w:lineRule="auto"/>
+              <w:rPr>
+                <w:rFonts w:ascii="Aptos" w:eastAsia="Aptos" w:hAnsi="Aptos"/>
+                <w:color w:val="auto"/>
+                <w:kern w:val="2"/>
+                <w:sz w:val="22"/>
+                <w:szCs w:val="22"/>
+                <w:lang w:eastAsia="en-US"/>
+                <w14:ligatures w14:val="standardContextual"/>
+              </w:rPr>
+            </w:pPr>
+            <w:r>
+              <w:rPr>
+                <w:rFonts w:ascii="Aptos" w:eastAsia="Aptos" w:hAnsi="Aptos"/>
+                <w:b/>
+                <w:bCs/>
+                <w:color w:val="auto"/>
+                <w:kern w:val="2"/>
+                <w:sz w:val="22"/>
+                <w:szCs w:val="22"/>
+                <w:lang w:eastAsia="en-US"/>
+                <w14:ligatures w14:val="standardContextual"/>
+              </w:rPr>
+              <w:t>FAO</w:t>
+            </w:r>
+          </w:p>
+        </w:tc>
+      </w:tr>
+      <w:tr>
+        <w:tc>
+          <w:tcPr>
+            <w:tcW w:w="0" w:type="auto"/>
+            <w:tcBorders>
+              <w:top w:val="single" w:sz="4" w:space="0" w:color="auto"/>
+              <w:left w:val="single" w:sz="4" w:space="0" w:color="auto"/>
+              <w:bottom w:val="single" w:sz="4" w:space="0" w:color="auto"/>
+              <w:right w:val="single" w:sz="4" w:space="0" w:color="auto"/>
+            </w:tcBorders>
+            <w:shd w:val="clear" w:color="auto" w:fill="21222C"/>
+            <w:tcMar>
+              <w:top w:w="30" w:type="dxa"/>
+              <w:left w:w="30" w:type="dxa"/>
+              <w:bottom w:w="30" w:type="dxa"/>
+              <w:right w:w="30" w:type="dxa"/>
+            </w:tcMar>
+            <w:vAlign w:val="center"/>
+            <w:hideMark/>
+          </w:tcPr>
+          <w:p>
+            <w:pPr>
+              <w:spacing w:after="160" w:line="259" w:lineRule="auto"/>
+              <w:rPr>
+                <w:rFonts w:ascii="Aptos" w:eastAsia="Aptos" w:hAnsi="Aptos"/>
+                <w:color w:val="auto"/>
+                <w:kern w:val="2"/>
+                <w:sz w:val="22"/>
+                <w:szCs w:val="22"/>
+                <w:lang w:eastAsia="en-US"/>
+                <w14:ligatures w14:val="standardContextual"/>
+              </w:rPr>
+            </w:pPr>
+            <w:r>
+              <w:rPr>
+                <w:rFonts w:ascii="Aptos" w:eastAsia="Aptos" w:hAnsi="Aptos"/>
+                <w:color w:val="auto"/>
+                <w:kern w:val="2"/>
+                <w:sz w:val="22"/>
+                <w:szCs w:val="22"/>
+                <w:lang w:eastAsia="en-US"/>
+                <w14:ligatures w14:val="standardContextual"/>
+              </w:rPr>
+              <w:t>62</w:t>
+            </w:r>
+          </w:p>
+        </w:tc>
+        <w:tc>
+          <w:tcPr>
+            <w:tcW w:w="0" w:type="auto"/>
+            <w:tcBorders>
+              <w:top w:val="single" w:sz="4" w:space="0" w:color="auto"/>
+              <w:left w:val="single" w:sz="4" w:space="0" w:color="auto"/>
+              <w:bottom w:val="single" w:sz="4" w:space="0" w:color="auto"/>
+              <w:right w:val="single" w:sz="4" w:space="0" w:color="auto"/>
+            </w:tcBorders>
+            <w:shd w:val="clear" w:color="auto" w:fill="21222C"/>
+            <w:tcMar>
+              <w:top w:w="30" w:type="dxa"/>
+              <w:left w:w="30" w:type="dxa"/>
+              <w:bottom w:w="30" w:type="dxa"/>
+              <w:right w:w="30" w:type="dxa"/>
+            </w:tcMar>
+            <w:vAlign w:val="center"/>
+            <w:hideMark/>
+          </w:tcPr>
+          <w:p>
+            <w:pPr>
+              <w:spacing w:after="160" w:line="259" w:lineRule="auto"/>
+              <w:rPr>
+                <w:rFonts w:ascii="Aptos" w:eastAsia="Aptos" w:hAnsi="Aptos"/>
+                <w:color w:val="auto"/>
+                <w:kern w:val="2"/>
+                <w:sz w:val="22"/>
+                <w:szCs w:val="22"/>
+                <w:lang w:eastAsia="en-US"/>
+                <w14:ligatures w14:val="standardContextual"/>
+              </w:rPr>
+            </w:pPr>
+            <w:r>
+              <w:rPr>
+                <w:rFonts w:ascii="Aptos" w:eastAsia="Aptos" w:hAnsi="Aptos"/>
+                <w:color w:val="auto"/>
+                <w:kern w:val="2"/>
+                <w:sz w:val="22"/>
+                <w:szCs w:val="22"/>
+                <w:lang w:eastAsia="en-US"/>
+                <w14:ligatures w14:val="standardContextual"/>
+              </w:rPr>
+              <w:t>Prácticas para establecer y manejar tu huerta</w:t>
+            </w:r>
+          </w:p>
+        </w:tc>
+        <w:tc>
+          <w:tcPr>
+            <w:tcW w:w="0" w:type="auto"/>
+            <w:tcBorders>
+              <w:top w:val="single" w:sz="4" w:space="0" w:color="auto"/>
+              <w:left w:val="single" w:sz="4" w:space="0" w:color="auto"/>
+              <w:bottom w:val="single" w:sz="4" w:space="0" w:color="auto"/>
+              <w:right w:val="single" w:sz="4" w:space="0" w:color="auto"/>
+            </w:tcBorders>
+            <w:shd w:val="clear" w:color="auto" w:fill="21222C"/>
+            <w:tcMar>
+              <w:top w:w="30" w:type="dxa"/>
+              <w:left w:w="30" w:type="dxa"/>
+              <w:bottom w:w="30" w:type="dxa"/>
+              <w:right w:w="30" w:type="dxa"/>
+            </w:tcMar>
+            <w:vAlign w:val="center"/>
+            <w:hideMark/>
+          </w:tcPr>
+          <w:p>
+            <w:pPr>
+              <w:spacing w:after="160" w:line="259" w:lineRule="auto"/>
+              <w:rPr>
+                <w:rFonts w:ascii="Aptos" w:eastAsia="Aptos" w:hAnsi="Aptos"/>
+                <w:color w:val="auto"/>
+                <w:kern w:val="2"/>
+                <w:sz w:val="22"/>
+                <w:szCs w:val="22"/>
+                <w:lang w:eastAsia="en-US"/>
+                <w14:ligatures w14:val="standardContextual"/>
+              </w:rPr>
+            </w:pPr>
+            <w:r>
+              <w:rPr>
+                <w:rFonts w:ascii="Aptos" w:eastAsia="Aptos" w:hAnsi="Aptos"/>
+                <w:color w:val="auto"/>
+                <w:kern w:val="2"/>
+                <w:sz w:val="22"/>
+                <w:szCs w:val="22"/>
+                <w:lang w:eastAsia="en-US"/>
+                <w14:ligatures w14:val="standardContextual"/>
+              </w:rPr>
+              <w:t>Jardín Botánico</w:t>
+            </w:r>
+          </w:p>
+        </w:tc>
+      </w:tr>
+      <w:tr>
+        <w:tc>
+          <w:tcPr>
+            <w:tcW w:w="0" w:type="auto"/>
+            <w:tcBorders>
+              <w:top w:val="single" w:sz="4" w:space="0" w:color="auto"/>
+              <w:left w:val="single" w:sz="4" w:space="0" w:color="auto"/>
+              <w:bottom w:val="single" w:sz="4" w:space="0" w:color="auto"/>
+              <w:right w:val="single" w:sz="4" w:space="0" w:color="auto"/>
+            </w:tcBorders>
+            <w:shd w:val="clear" w:color="auto" w:fill="21222C"/>
+            <w:tcMar>
+              <w:top w:w="30" w:type="dxa"/>
+              <w:left w:w="30" w:type="dxa"/>
+              <w:bottom w:w="30" w:type="dxa"/>
+              <w:right w:w="30" w:type="dxa"/>
+            </w:tcMar>
+            <w:vAlign w:val="center"/>
+            <w:hideMark/>
+          </w:tcPr>
+          <w:p>
+            <w:pPr>
+              <w:spacing w:after="160" w:line="259" w:lineRule="auto"/>
+              <w:rPr>
+                <w:rFonts w:ascii="Aptos" w:eastAsia="Aptos" w:hAnsi="Aptos"/>
+                <w:color w:val="auto"/>
+                <w:kern w:val="2"/>
+                <w:sz w:val="22"/>
+                <w:szCs w:val="22"/>
+                <w:lang w:eastAsia="en-US"/>
+                <w14:ligatures w14:val="standardContextual"/>
+              </w:rPr>
+            </w:pPr>
+            <w:r>
+              <w:rPr>
+                <w:rFonts w:ascii="Aptos" w:eastAsia="Aptos" w:hAnsi="Aptos"/>
+                <w:color w:val="auto"/>
+                <w:kern w:val="2"/>
+                <w:sz w:val="22"/>
+                <w:szCs w:val="22"/>
+                <w:lang w:eastAsia="en-US"/>
+                <w14:ligatures w14:val="standardContextual"/>
+              </w:rPr>
+              <w:t>46</w:t>
+            </w:r>
+          </w:p>
+        </w:tc>
+        <w:tc>
+          <w:tcPr>
+            <w:tcW w:w="0" w:type="auto"/>
+            <w:tcBorders>
+              <w:top w:val="single" w:sz="4" w:space="0" w:color="auto"/>
+              <w:left w:val="single" w:sz="4" w:space="0" w:color="auto"/>
+              <w:bottom w:val="single" w:sz="4" w:space="0" w:color="auto"/>
+              <w:right w:val="single" w:sz="4" w:space="0" w:color="auto"/>
+            </w:tcBorders>
+            <w:shd w:val="clear" w:color="auto" w:fill="21222C"/>
+            <w:tcMar>
+              <w:top w:w="30" w:type="dxa"/>
+              <w:left w:w="30" w:type="dxa"/>
+              <w:bottom w:w="30" w:type="dxa"/>
+              <w:right w:w="30" w:type="dxa"/>
+            </w:tcMar>
+            <w:vAlign w:val="center"/>
+            <w:hideMark/>
+          </w:tcPr>
+          <w:p>
+            <w:pPr>
+              <w:spacing w:after="160" w:line="259" w:lineRule="auto"/>
+              <w:rPr>
+                <w:rFonts w:ascii="Aptos" w:eastAsia="Aptos" w:hAnsi="Aptos"/>
+                <w:color w:val="auto"/>
+                <w:kern w:val="2"/>
+                <w:sz w:val="22"/>
+                <w:szCs w:val="22"/>
+                <w:lang w:eastAsia="en-US"/>
+                <w14:ligatures w14:val="standardContextual"/>
+              </w:rPr>
+            </w:pPr>
+            <w:r>
+              <w:rPr>
+                <w:rFonts w:ascii="Aptos" w:eastAsia="Aptos" w:hAnsi="Aptos"/>
+                <w:color w:val="auto"/>
+                <w:kern w:val="2"/>
+                <w:sz w:val="22"/>
+                <w:szCs w:val="22"/>
+                <w:lang w:eastAsia="en-US"/>
+                <w14:ligatures w14:val="standardContextual"/>
+              </w:rPr>
+              <w:t>Cartilla 1. Agricultura urbana</w:t>
+            </w:r>
+          </w:p>
+        </w:tc>
+        <w:tc>
+          <w:tcPr>
+            <w:tcW w:w="0" w:type="auto"/>
+            <w:tcBorders>
+              <w:top w:val="single" w:sz="4" w:space="0" w:color="auto"/>
+              <w:left w:val="single" w:sz="4" w:space="0" w:color="auto"/>
+              <w:bottom w:val="single" w:sz="4" w:space="0" w:color="auto"/>
+              <w:right w:val="single" w:sz="4" w:space="0" w:color="auto"/>
+            </w:tcBorders>
+            <w:shd w:val="clear" w:color="auto" w:fill="21222C"/>
+            <w:tcMar>
+              <w:top w:w="30" w:type="dxa"/>
+              <w:left w:w="30" w:type="dxa"/>
+              <w:bottom w:w="30" w:type="dxa"/>
+              <w:right w:w="30" w:type="dxa"/>
+            </w:tcMar>
+            <w:vAlign w:val="center"/>
+            <w:hideMark/>
+          </w:tcPr>
+          <w:p>
+            <w:pPr>
+              <w:spacing w:after="160" w:line="259" w:lineRule="auto"/>
+              <w:rPr>
+                <w:rFonts w:ascii="Aptos" w:eastAsia="Aptos" w:hAnsi="Aptos"/>
+                <w:color w:val="auto"/>
+                <w:kern w:val="2"/>
+                <w:sz w:val="22"/>
+                <w:szCs w:val="22"/>
+                <w:lang w:eastAsia="en-US"/>
+                <w14:ligatures w14:val="standardContextual"/>
+              </w:rPr>
+            </w:pPr>
+            <w:r>
+              <w:rPr>
+                <w:rFonts w:ascii="Aptos" w:eastAsia="Aptos" w:hAnsi="Aptos"/>
+                <w:color w:val="auto"/>
+                <w:kern w:val="2"/>
+                <w:sz w:val="22"/>
+                <w:szCs w:val="22"/>
+                <w:lang w:eastAsia="en-US"/>
+                <w14:ligatures w14:val="standardContextual"/>
+              </w:rPr>
+              <w:t>Jardín Botánico</w:t>
+            </w:r>
+          </w:p>
+        </w:tc>
+      </w:tr>
+      <w:tr>
+        <w:tc>
+          <w:tcPr>
+            <w:tcW w:w="0" w:type="auto"/>
+            <w:tcBorders>
+              <w:top w:val="single" w:sz="4" w:space="0" w:color="auto"/>
+              <w:left w:val="single" w:sz="4" w:space="0" w:color="auto"/>
+              <w:bottom w:val="single" w:sz="4" w:space="0" w:color="auto"/>
+              <w:right w:val="single" w:sz="4" w:space="0" w:color="auto"/>
+            </w:tcBorders>
+            <w:shd w:val="clear" w:color="auto" w:fill="21222C"/>
+            <w:tcMar>
+              <w:top w:w="30" w:type="dxa"/>
+              <w:left w:w="30" w:type="dxa"/>
+              <w:bottom w:w="30" w:type="dxa"/>
+              <w:right w:w="30" w:type="dxa"/>
+            </w:tcMar>
+            <w:vAlign w:val="center"/>
+            <w:hideMark/>
+          </w:tcPr>
+          <w:p>
+            <w:pPr>
+              <w:spacing w:after="160" w:line="259" w:lineRule="auto"/>
+              <w:rPr>
+                <w:rFonts w:ascii="Aptos" w:eastAsia="Aptos" w:hAnsi="Aptos"/>
+                <w:color w:val="auto"/>
+                <w:kern w:val="2"/>
+                <w:sz w:val="22"/>
+                <w:szCs w:val="22"/>
+                <w:lang w:eastAsia="en-US"/>
+                <w14:ligatures w14:val="standardContextual"/>
+              </w:rPr>
+            </w:pPr>
+            <w:r>
+              <w:rPr>
+                <w:rFonts w:ascii="Aptos" w:eastAsia="Aptos" w:hAnsi="Aptos"/>
+                <w:b/>
+                <w:bCs/>
+                <w:color w:val="auto"/>
+                <w:kern w:val="2"/>
+                <w:sz w:val="22"/>
+                <w:szCs w:val="22"/>
+                <w:lang w:eastAsia="en-US"/>
+                <w14:ligatures w14:val="standardContextual"/>
+              </w:rPr>
+              <w:t>46</w:t>
+            </w:r>
+          </w:p>
+        </w:tc>
+        <w:tc>
+          <w:tcPr>
+            <w:tcW w:w="0" w:type="auto"/>
+            <w:tcBorders>
+              <w:top w:val="single" w:sz="4" w:space="0" w:color="auto"/>
+              <w:left w:val="single" w:sz="4" w:space="0" w:color="auto"/>
+              <w:bottom w:val="single" w:sz="4" w:space="0" w:color="auto"/>
+              <w:right w:val="single" w:sz="4" w:space="0" w:color="auto"/>
+            </w:tcBorders>
+            <w:shd w:val="clear" w:color="auto" w:fill="21222C"/>
+            <w:tcMar>
+              <w:top w:w="30" w:type="dxa"/>
+              <w:left w:w="30" w:type="dxa"/>
+              <w:bottom w:w="30" w:type="dxa"/>
+              <w:right w:w="30" w:type="dxa"/>
+            </w:tcMar>
+            <w:vAlign w:val="center"/>
+            <w:hideMark/>
+          </w:tcPr>
+          <w:p>
+            <w:pPr>
+              <w:spacing w:after="160" w:line="259" w:lineRule="auto"/>
+              <w:rPr>
+                <w:rFonts w:ascii="Aptos" w:eastAsia="Aptos" w:hAnsi="Aptos"/>
+                <w:color w:val="auto"/>
+                <w:kern w:val="2"/>
+                <w:sz w:val="22"/>
+                <w:szCs w:val="22"/>
+                <w:lang w:eastAsia="en-US"/>
+                <w14:ligatures w14:val="standardContextual"/>
+              </w:rPr>
+            </w:pPr>
+            <w:r>
+              <w:rPr>
+                <w:rFonts w:ascii="Aptos" w:eastAsia="Aptos" w:hAnsi="Aptos"/>
+                <w:b/>
+                <w:bCs/>
+                <w:color w:val="auto"/>
+                <w:kern w:val="2"/>
+                <w:sz w:val="22"/>
+                <w:szCs w:val="22"/>
+                <w:lang w:eastAsia="en-US"/>
+                <w14:ligatures w14:val="standardContextual"/>
+              </w:rPr>
+              <w:t>Protocolo de espacio público, Decreto 315/2024</w:t>
+            </w:r>
+          </w:p>
+        </w:tc>
+        <w:tc>
+          <w:tcPr>
+            <w:tcW w:w="0" w:type="auto"/>
+            <w:tcBorders>
+              <w:top w:val="single" w:sz="4" w:space="0" w:color="auto"/>
+              <w:left w:val="single" w:sz="4" w:space="0" w:color="auto"/>
+              <w:bottom w:val="single" w:sz="4" w:space="0" w:color="auto"/>
+              <w:right w:val="single" w:sz="4" w:space="0" w:color="auto"/>
+            </w:tcBorders>
+            <w:shd w:val="clear" w:color="auto" w:fill="21222C"/>
+            <w:tcMar>
+              <w:top w:w="30" w:type="dxa"/>
+              <w:left w:w="30" w:type="dxa"/>
+              <w:bottom w:w="30" w:type="dxa"/>
+              <w:right w:w="30" w:type="dxa"/>
+            </w:tcMar>
+            <w:vAlign w:val="center"/>
+            <w:hideMark/>
+          </w:tcPr>
+          <w:p>
+            <w:pPr>
+              <w:spacing w:after="160" w:line="259" w:lineRule="auto"/>
+              <w:rPr>
+                <w:rFonts w:ascii="Aptos" w:eastAsia="Aptos" w:hAnsi="Aptos"/>
+                <w:color w:val="auto"/>
+                <w:kern w:val="2"/>
+                <w:sz w:val="22"/>
+                <w:szCs w:val="22"/>
+                <w:lang w:eastAsia="en-US"/>
+                <w14:ligatures w14:val="standardContextual"/>
+              </w:rPr>
+            </w:pPr>
+            <w:r>
+              <w:rPr>
+                <w:rFonts w:ascii="Aptos" w:eastAsia="Aptos" w:hAnsi="Aptos"/>
+                <w:color w:val="auto"/>
+                <w:kern w:val="2"/>
+                <w:sz w:val="22"/>
+                <w:szCs w:val="22"/>
+                <w:lang w:eastAsia="en-US"/>
+                <w14:ligatures w14:val="standardContextual"/>
+              </w:rPr>
+              <w:t>Jardín Botánico</w:t>
+            </w:r>
+          </w:p>
+        </w:tc>
+      </w:tr>
+      <w:tr>
+        <w:tc>
+          <w:tcPr>
+            <w:tcW w:w="0" w:type="auto"/>
+            <w:tcBorders>
+              <w:top w:val="single" w:sz="4" w:space="0" w:color="auto"/>
+              <w:left w:val="single" w:sz="4" w:space="0" w:color="auto"/>
+              <w:bottom w:val="single" w:sz="4" w:space="0" w:color="auto"/>
+              <w:right w:val="single" w:sz="4" w:space="0" w:color="auto"/>
+            </w:tcBorders>
+            <w:shd w:val="clear" w:color="auto" w:fill="21222C"/>
+            <w:tcMar>
+              <w:top w:w="30" w:type="dxa"/>
+              <w:left w:w="30" w:type="dxa"/>
+              <w:bottom w:w="30" w:type="dxa"/>
+              <w:right w:w="30" w:type="dxa"/>
+            </w:tcMar>
+            <w:vAlign w:val="center"/>
+            <w:hideMark/>
+          </w:tcPr>
+          <w:p>
+            <w:pPr>
+              <w:spacing w:after="160" w:line="259" w:lineRule="auto"/>
+              <w:rPr>
+                <w:rFonts w:ascii="Aptos" w:eastAsia="Aptos" w:hAnsi="Aptos"/>
+                <w:color w:val="auto"/>
+                <w:kern w:val="2"/>
+                <w:sz w:val="22"/>
+                <w:szCs w:val="22"/>
+                <w:lang w:eastAsia="en-US"/>
+                <w14:ligatures w14:val="standardContextual"/>
+              </w:rPr>
+            </w:pPr>
+            <w:r>
+              <w:rPr>
+                <w:rFonts w:ascii="Aptos" w:eastAsia="Aptos" w:hAnsi="Aptos"/>
+                <w:color w:val="auto"/>
+                <w:kern w:val="2"/>
+                <w:sz w:val="22"/>
+                <w:szCs w:val="22"/>
+                <w:lang w:eastAsia="en-US"/>
+                <w14:ligatures w14:val="standardContextual"/>
+              </w:rPr>
+              <w:t>34</w:t>
+            </w:r>
+          </w:p>
+        </w:tc>
+        <w:tc>
+          <w:tcPr>
+            <w:tcW w:w="0" w:type="auto"/>
+            <w:tcBorders>
+              <w:top w:val="single" w:sz="4" w:space="0" w:color="auto"/>
+              <w:left w:val="single" w:sz="4" w:space="0" w:color="auto"/>
+              <w:bottom w:val="single" w:sz="4" w:space="0" w:color="auto"/>
+              <w:right w:val="single" w:sz="4" w:space="0" w:color="auto"/>
+            </w:tcBorders>
+            <w:shd w:val="clear" w:color="auto" w:fill="21222C"/>
+            <w:tcMar>
+              <w:top w:w="30" w:type="dxa"/>
+              <w:left w:w="30" w:type="dxa"/>
+              <w:bottom w:w="30" w:type="dxa"/>
+              <w:right w:w="30" w:type="dxa"/>
+            </w:tcMar>
+            <w:vAlign w:val="center"/>
+            <w:hideMark/>
+          </w:tcPr>
+          <w:p>
+            <w:pPr>
+              <w:spacing w:after="160" w:line="259" w:lineRule="auto"/>
+              <w:rPr>
+                <w:rFonts w:ascii="Aptos" w:eastAsia="Aptos" w:hAnsi="Aptos"/>
+                <w:color w:val="auto"/>
+                <w:kern w:val="2"/>
+                <w:sz w:val="22"/>
+                <w:szCs w:val="22"/>
+                <w:lang w:eastAsia="en-US"/>
+                <w14:ligatures w14:val="standardContextual"/>
+              </w:rPr>
+            </w:pPr>
+            <w:r>
+              <w:rPr>
+                <w:rFonts w:ascii="Aptos" w:eastAsia="Aptos" w:hAnsi="Aptos"/>
+                <w:color w:val="auto"/>
+                <w:kern w:val="2"/>
+                <w:sz w:val="22"/>
+                <w:szCs w:val="22"/>
+                <w:lang w:eastAsia="en-US"/>
+                <w14:ligatures w14:val="standardContextual"/>
+              </w:rPr>
+              <w:t>Manejo integrado de fertilización y plagas</w:t>
+            </w:r>
+          </w:p>
+        </w:tc>
+        <w:tc>
+          <w:tcPr>
+            <w:tcW w:w="0" w:type="auto"/>
+            <w:tcBorders>
+              <w:top w:val="single" w:sz="4" w:space="0" w:color="auto"/>
+              <w:left w:val="single" w:sz="4" w:space="0" w:color="auto"/>
+              <w:bottom w:val="single" w:sz="4" w:space="0" w:color="auto"/>
+              <w:right w:val="single" w:sz="4" w:space="0" w:color="auto"/>
+            </w:tcBorders>
+            <w:shd w:val="clear" w:color="auto" w:fill="21222C"/>
+            <w:tcMar>
+              <w:top w:w="30" w:type="dxa"/>
+              <w:left w:w="30" w:type="dxa"/>
+              <w:bottom w:w="30" w:type="dxa"/>
+              <w:right w:w="30" w:type="dxa"/>
+            </w:tcMar>
+            <w:vAlign w:val="center"/>
+            <w:hideMark/>
+          </w:tcPr>
+          <w:p>
+            <w:pPr>
+              <w:spacing w:after="160" w:line="259" w:lineRule="auto"/>
+              <w:rPr>
+                <w:rFonts w:ascii="Aptos" w:eastAsia="Aptos" w:hAnsi="Aptos"/>
+                <w:color w:val="auto"/>
+                <w:kern w:val="2"/>
+                <w:sz w:val="22"/>
+                <w:szCs w:val="22"/>
+                <w:lang w:eastAsia="en-US"/>
+                <w14:ligatures w14:val="standardContextual"/>
+              </w:rPr>
+            </w:pPr>
+            <w:r>
+              <w:rPr>
+                <w:rFonts w:ascii="Aptos" w:eastAsia="Aptos" w:hAnsi="Aptos"/>
+                <w:color w:val="auto"/>
+                <w:kern w:val="2"/>
+                <w:sz w:val="22"/>
+                <w:szCs w:val="22"/>
+                <w:lang w:eastAsia="en-US"/>
+                <w14:ligatures w14:val="standardContextual"/>
+              </w:rPr>
+              <w:t>Jardín Botánico</w:t>
+            </w:r>
+          </w:p>
+        </w:tc>
+      </w:tr>
+    </w:tbl>
     <w:p/>
     <w:sectPr>
       <w:footerReference w:type="default" r:id="rId15"/>
@@ -16652,7 +17379,7 @@
 </file>
 
 <file path=word/endnotes.xml><?xml version="1.0" encoding="utf-8"?>
-<w:endnotes xmlns:wpc="http://schemas.microsoft.com/office/word/2010/wordprocessingCanvas" xmlns:cx="http://schemas.microsoft.com/office/drawing/2014/chartex" xmlns:cx1="http://schemas.microsoft.com/office/drawing/2015/9/8/chartex" xmlns:cx2="http://schemas.microsoft.com/office/drawing/2015/10/21/chartex" xmlns:cx3="http://schemas.microsoft.com/office/drawing/2016/5/9/chartex" xmlns:cx4="http://schemas.microsoft.com/office/drawing/2016/5/10/chartex" xmlns:cx5="http://schemas.microsoft.com/office/drawing/2016/5/11/chartex" xmlns:cx6="http://schemas.microsoft.com/office/drawing/2016/5/12/chartex" xmlns:cx7="http://schemas.microsoft.com/office/drawing/2016/5/13/chartex" xmlns:cx8="http://schemas.microsoft.com/office/drawing/2016/5/14/chartex" xmlns:mc="http://schemas.openxmlformats.org/markup-compatibility/2006" xmlns:aink="http://schemas.microsoft.com/office/drawing/2016/ink" xmlns:am3d="http://schemas.microsoft.com/office/drawing/2017/model3d" xmlns:o="urn:schemas-microsoft-com:office:office" xmlns:oel="http://schemas.microsoft.com/office/2019/extlst" xmlns:r="http://schemas.openxmlformats.org/officeDocument/2006/relationships" xmlns:m="http://schemas.openxmlformats.org/officeDocument/2006/math" xmlns:v="urn:schemas-microsoft-com:vml" xmlns:wp14="http://schemas.microsoft.com/office/word/2010/wordprocessingDrawing" xmlns:wp="http://schemas.openxmlformats.org/drawingml/2006/wordprocessingDrawing" xmlns:w10="urn:schemas-microsoft-com:office:word" xmlns:w="http://schemas.openxmlformats.org/wordprocessingml/2006/main" xmlns:w14="http://schemas.microsoft.com/office/word/2010/wordml" xmlns:w15="http://schemas.microsoft.com/office/word/2012/wordml" xmlns:w16cex="http://schemas.microsoft.com/office/word/2018/wordml/cex" xmlns:w16cid="http://schemas.microsoft.com/office/word/2016/wordml/cid" xmlns:w16="http://schemas.microsoft.com/office/word/2018/wordml" xmlns:w16du="http://schemas.microsoft.com/office/word/2023/wordml/word16du" xmlns:w16sdtdh="http://schemas.microsoft.com/office/word/2020/wordml/sdtdatahash" xmlns:w16sdtfl="http://schemas.microsoft.com/office/word/2024/wordml/sdtformatlock" xmlns:w16se="http://schemas.microsoft.com/office/word/2015/wordml/symex" xmlns:wpg="http://schemas.microsoft.com/office/word/2010/wordprocessingGroup" xmlns:wpi="http://schemas.microsoft.com/office/word/2010/wordprocessingInk" xmlns:wne="http://schemas.microsoft.com/office/word/2006/wordml" xmlns:wps="http://schemas.microsoft.com/office/word/2010/wordprocessingShape" mc:Ignorable="w14 w15 w16se w16cid w16 w16cex w16sdtdh w16sdtfl w16du wp14">
+<w:endnotes xmlns:wpc="http://schemas.microsoft.com/office/word/2010/wordprocessingCanvas" xmlns:cx="http://schemas.microsoft.com/office/drawing/2014/chartex" xmlns:cx1="http://schemas.microsoft.com/office/drawing/2015/9/8/chartex" xmlns:cx2="http://schemas.microsoft.com/office/drawing/2015/10/21/chartex" xmlns:cx3="http://schemas.microsoft.com/office/drawing/2016/5/9/chartex" xmlns:cx4="http://schemas.microsoft.com/office/drawing/2016/5/10/chartex" xmlns:cx5="http://schemas.microsoft.com/office/drawing/2016/5/11/chartex" xmlns:cx6="http://schemas.microsoft.com/office/drawing/2016/5/12/chartex" xmlns:cx7="http://schemas.microsoft.com/office/drawing/2016/5/13/chartex" xmlns:cx8="http://schemas.microsoft.com/office/drawing/2016/5/14/chartex" xmlns:mc="http://schemas.openxmlformats.org/markup-compatibility/2006" xmlns:aink="http://schemas.microsoft.com/office/drawing/2016/ink" xmlns:am3d="http://schemas.microsoft.com/office/drawing/2017/model3d" xmlns:o="urn:schemas-microsoft-com:office:office" xmlns:oel="http://schemas.microsoft.com/office/2019/extlst" xmlns:r="http://schemas.openxmlformats.org/officeDocument/2006/relationships" xmlns:m="http://schemas.openxmlformats.org/officeDocument/2006/math" xmlns:v="urn:schemas-microsoft-com:vml" xmlns:wp14="http://schemas.microsoft.com/office/word/2010/wordprocessingDrawing" xmlns:wp="http://schemas.openxmlformats.org/drawingml/2006/wordprocessingDrawing" xmlns:w10="urn:schemas-microsoft-com:office:word" xmlns:w="http://schemas.openxmlformats.org/wordprocessingml/2006/main" xmlns:w14="http://schemas.microsoft.com/office/word/2010/wordml" xmlns:w15="http://schemas.microsoft.com/office/word/2012/wordml" xmlns:w16cei="http://schemas.microsoft.com/office/word/2026/wordml/cei" xmlns:w16cex="http://schemas.microsoft.com/office/word/2018/wordml/cex" xmlns:w16cid="http://schemas.microsoft.com/office/word/2016/wordml/cid" xmlns:w16="http://schemas.microsoft.com/office/word/2018/wordml" xmlns:w16du="http://schemas.microsoft.com/office/word/2023/wordml/word16du" xmlns:w16sdtdh="http://schemas.microsoft.com/office/word/2020/wordml/sdtdatahash" xmlns:w16sdtfl="http://schemas.microsoft.com/office/word/2024/wordml/sdtformatlock" xmlns:w16se="http://schemas.microsoft.com/office/word/2015/wordml/symex" xmlns:wpg="http://schemas.microsoft.com/office/word/2010/wordprocessingGroup" xmlns:wpi="http://schemas.microsoft.com/office/word/2010/wordprocessingInk" xmlns:wne="http://schemas.microsoft.com/office/word/2006/wordml" xmlns:wps="http://schemas.microsoft.com/office/word/2010/wordprocessingShape" mc:Ignorable="w14 w15 w16se w16cid w16 w16cex w16sdtdh w16sdtfl w16du wp14">
   <w:endnote w:type="separator" w:id="-1">
     <w:p>
       <w:r>
@@ -16671,7 +17398,7 @@
 </file>
 
 <file path=word/footer1.xml><?xml version="1.0" encoding="utf-8"?>
-<w:ftr xmlns:wpc="http://schemas.microsoft.com/office/word/2010/wordprocessingCanvas" xmlns:cx="http://schemas.microsoft.com/office/drawing/2014/chartex" xmlns:cx1="http://schemas.microsoft.com/office/drawing/2015/9/8/chartex" xmlns:cx2="http://schemas.microsoft.com/office/drawing/2015/10/21/chartex" xmlns:cx3="http://schemas.microsoft.com/office/drawing/2016/5/9/chartex" xmlns:cx4="http://schemas.microsoft.com/office/drawing/2016/5/10/chartex" xmlns:cx5="http://schemas.microsoft.com/office/drawing/2016/5/11/chartex" xmlns:cx6="http://schemas.microsoft.com/office/drawing/2016/5/12/chartex" xmlns:cx7="http://schemas.microsoft.com/office/drawing/2016/5/13/chartex" xmlns:cx8="http://schemas.microsoft.com/office/drawing/2016/5/14/chartex" xmlns:mc="http://schemas.openxmlformats.org/markup-compatibility/2006" xmlns:aink="http://schemas.microsoft.com/office/drawing/2016/ink" xmlns:am3d="http://schemas.microsoft.com/office/drawing/2017/model3d" xmlns:o="urn:schemas-microsoft-com:office:office" xmlns:oel="http://schemas.microsoft.com/office/2019/extlst" xmlns:r="http://schemas.openxmlformats.org/officeDocument/2006/relationships" xmlns:m="http://schemas.openxmlformats.org/officeDocument/2006/math" xmlns:v="urn:schemas-microsoft-com:vml" xmlns:wp14="http://schemas.microsoft.com/office/word/2010/wordprocessingDrawing" xmlns:wp="http://schemas.openxmlformats.org/drawingml/2006/wordprocessingDrawing" xmlns:w10="urn:schemas-microsoft-com:office:word" xmlns:w="http://schemas.openxmlformats.org/wordprocessingml/2006/main" xmlns:w14="http://schemas.microsoft.com/office/word/2010/wordml" xmlns:w15="http://schemas.microsoft.com/office/word/2012/wordml" xmlns:w16cex="http://schemas.microsoft.com/office/word/2018/wordml/cex" xmlns:w16cid="http://schemas.microsoft.com/office/word/2016/wordml/cid" xmlns:w16="http://schemas.microsoft.com/office/word/2018/wordml" xmlns:w16du="http://schemas.microsoft.com/office/word/2023/wordml/word16du" xmlns:w16sdtdh="http://schemas.microsoft.com/office/word/2020/wordml/sdtdatahash" xmlns:w16sdtfl="http://schemas.microsoft.com/office/word/2024/wordml/sdtformatlock" xmlns:w16se="http://schemas.microsoft.com/office/word/2015/wordml/symex" xmlns:wpg="http://schemas.microsoft.com/office/word/2010/wordprocessingGroup" xmlns:wpi="http://schemas.microsoft.com/office/word/2010/wordprocessingInk" xmlns:wne="http://schemas.microsoft.com/office/word/2006/wordml" xmlns:wps="http://schemas.microsoft.com/office/word/2010/wordprocessingShape" mc:Ignorable="w14 w15 w16se w16cid w16 w16cex w16sdtdh w16sdtfl w16du wp14">
+<w:ftr xmlns:wpc="http://schemas.microsoft.com/office/word/2010/wordprocessingCanvas" xmlns:cx="http://schemas.microsoft.com/office/drawing/2014/chartex" xmlns:cx1="http://schemas.microsoft.com/office/drawing/2015/9/8/chartex" xmlns:cx2="http://schemas.microsoft.com/office/drawing/2015/10/21/chartex" xmlns:cx3="http://schemas.microsoft.com/office/drawing/2016/5/9/chartex" xmlns:cx4="http://schemas.microsoft.com/office/drawing/2016/5/10/chartex" xmlns:cx5="http://schemas.microsoft.com/office/drawing/2016/5/11/chartex" xmlns:cx6="http://schemas.microsoft.com/office/drawing/2016/5/12/chartex" xmlns:cx7="http://schemas.microsoft.com/office/drawing/2016/5/13/chartex" xmlns:cx8="http://schemas.microsoft.com/office/drawing/2016/5/14/chartex" xmlns:mc="http://schemas.openxmlformats.org/markup-compatibility/2006" xmlns:aink="http://schemas.microsoft.com/office/drawing/2016/ink" xmlns:am3d="http://schemas.microsoft.com/office/drawing/2017/model3d" xmlns:o="urn:schemas-microsoft-com:office:office" xmlns:oel="http://schemas.microsoft.com/office/2019/extlst" xmlns:r="http://schemas.openxmlformats.org/officeDocument/2006/relationships" xmlns:m="http://schemas.openxmlformats.org/officeDocument/2006/math" xmlns:v="urn:schemas-microsoft-com:vml" xmlns:wp14="http://schemas.microsoft.com/office/word/2010/wordprocessingDrawing" xmlns:wp="http://schemas.openxmlformats.org/drawingml/2006/wordprocessingDrawing" xmlns:w10="urn:schemas-microsoft-com:office:word" xmlns:w="http://schemas.openxmlformats.org/wordprocessingml/2006/main" xmlns:w14="http://schemas.microsoft.com/office/word/2010/wordml" xmlns:w15="http://schemas.microsoft.com/office/word/2012/wordml" xmlns:w16cei="http://schemas.microsoft.com/office/word/2026/wordml/cei" xmlns:w16cex="http://schemas.microsoft.com/office/word/2018/wordml/cex" xmlns:w16cid="http://schemas.microsoft.com/office/word/2016/wordml/cid" xmlns:w16="http://schemas.microsoft.com/office/word/2018/wordml" xmlns:w16du="http://schemas.microsoft.com/office/word/2023/wordml/word16du" xmlns:w16sdtdh="http://schemas.microsoft.com/office/word/2020/wordml/sdtdatahash" xmlns:w16sdtfl="http://schemas.microsoft.com/office/word/2024/wordml/sdtformatlock" xmlns:w16se="http://schemas.microsoft.com/office/word/2015/wordml/symex" xmlns:wpg="http://schemas.microsoft.com/office/word/2010/wordprocessingGroup" xmlns:wpi="http://schemas.microsoft.com/office/word/2010/wordprocessingInk" xmlns:wne="http://schemas.microsoft.com/office/word/2006/wordml" xmlns:wps="http://schemas.microsoft.com/office/word/2010/wordprocessingShape" mc:Ignorable="w14 w15 w16se w16cid w16 w16cex w16sdtdh w16sdtfl w16du wp14">
   <w:p>
     <w:pPr>
       <w:jc w:val="center"/>
@@ -16717,7 +17444,7 @@
 </file>
 
 <file path=word/footnotes.xml><?xml version="1.0" encoding="utf-8"?>
-<w:footnotes xmlns:wpc="http://schemas.microsoft.com/office/word/2010/wordprocessingCanvas" xmlns:cx="http://schemas.microsoft.com/office/drawing/2014/chartex" xmlns:cx1="http://schemas.microsoft.com/office/drawing/2015/9/8/chartex" xmlns:cx2="http://schemas.microsoft.com/office/drawing/2015/10/21/chartex" xmlns:cx3="http://schemas.microsoft.com/office/drawing/2016/5/9/chartex" xmlns:cx4="http://schemas.microsoft.com/office/drawing/2016/5/10/chartex" xmlns:cx5="http://schemas.microsoft.com/office/drawing/2016/5/11/chartex" xmlns:cx6="http://schemas.microsoft.com/office/drawing/2016/5/12/chartex" xmlns:cx7="http://schemas.microsoft.com/office/drawing/2016/5/13/chartex" xmlns:cx8="http://schemas.microsoft.com/office/drawing/2016/5/14/chartex" xmlns:mc="http://schemas.openxmlformats.org/markup-compatibility/2006" xmlns:aink="http://schemas.microsoft.com/office/drawing/2016/ink" xmlns:am3d="http://schemas.microsoft.com/office/drawing/2017/model3d" xmlns:o="urn:schemas-microsoft-com:office:office" xmlns:oel="http://schemas.microsoft.com/office/2019/extlst" xmlns:r="http://schemas.openxmlformats.org/officeDocument/2006/relationships" xmlns:m="http://schemas.openxmlformats.org/officeDocument/2006/math" xmlns:v="urn:schemas-microsoft-com:vml" xmlns:wp14="http://schemas.microsoft.com/office/word/2010/wordprocessingDrawing" xmlns:wp="http://schemas.openxmlformats.org/drawingml/2006/wordprocessingDrawing" xmlns:w10="urn:schemas-microsoft-com:office:word" xmlns:w="http://schemas.openxmlformats.org/wordprocessingml/2006/main" xmlns:w14="http://schemas.microsoft.com/office/word/2010/wordml" xmlns:w15="http://schemas.microsoft.com/office/word/2012/wordml" xmlns:w16cex="http://schemas.microsoft.com/office/word/2018/wordml/cex" xmlns:w16cid="http://schemas.microsoft.com/office/word/2016/wordml/cid" xmlns:w16="http://schemas.microsoft.com/office/word/2018/wordml" xmlns:w16du="http://schemas.microsoft.com/office/word/2023/wordml/word16du" xmlns:w16sdtdh="http://schemas.microsoft.com/office/word/2020/wordml/sdtdatahash" xmlns:w16sdtfl="http://schemas.microsoft.com/office/word/2024/wordml/sdtformatlock" xmlns:w16se="http://schemas.microsoft.com/office/word/2015/wordml/symex" xmlns:wpg="http://schemas.microsoft.com/office/word/2010/wordprocessingGroup" xmlns:wpi="http://schemas.microsoft.com/office/word/2010/wordprocessingInk" xmlns:wne="http://schemas.microsoft.com/office/word/2006/wordml" xmlns:wps="http://schemas.microsoft.com/office/word/2010/wordprocessingShape" mc:Ignorable="w14 w15 w16se w16cid w16 w16cex w16sdtdh w16sdtfl w16du wp14">
+<w:footnotes xmlns:wpc="http://schemas.microsoft.com/office/word/2010/wordprocessingCanvas" xmlns:cx="http://schemas.microsoft.com/office/drawing/2014/chartex" xmlns:cx1="http://schemas.microsoft.com/office/drawing/2015/9/8/chartex" xmlns:cx2="http://schemas.microsoft.com/office/drawing/2015/10/21/chartex" xmlns:cx3="http://schemas.microsoft.com/office/drawing/2016/5/9/chartex" xmlns:cx4="http://schemas.microsoft.com/office/drawing/2016/5/10/chartex" xmlns:cx5="http://schemas.microsoft.com/office/drawing/2016/5/11/chartex" xmlns:cx6="http://schemas.microsoft.com/office/drawing/2016/5/12/chartex" xmlns:cx7="http://schemas.microsoft.com/office/drawing/2016/5/13/chartex" xmlns:cx8="http://schemas.microsoft.com/office/drawing/2016/5/14/chartex" xmlns:mc="http://schemas.openxmlformats.org/markup-compatibility/2006" xmlns:aink="http://schemas.microsoft.com/office/drawing/2016/ink" xmlns:am3d="http://schemas.microsoft.com/office/drawing/2017/model3d" xmlns:o="urn:schemas-microsoft-com:office:office" xmlns:oel="http://schemas.microsoft.com/office/2019/extlst" xmlns:r="http://schemas.openxmlformats.org/officeDocument/2006/relationships" xmlns:m="http://schemas.openxmlformats.org/officeDocument/2006/math" xmlns:v="urn:schemas-microsoft-com:vml" xmlns:wp14="http://schemas.microsoft.com/office/word/2010/wordprocessingDrawing" xmlns:wp="http://schemas.openxmlformats.org/drawingml/2006/wordprocessingDrawing" xmlns:w10="urn:schemas-microsoft-com:office:word" xmlns:w="http://schemas.openxmlformats.org/wordprocessingml/2006/main" xmlns:w14="http://schemas.microsoft.com/office/word/2010/wordml" xmlns:w15="http://schemas.microsoft.com/office/word/2012/wordml" xmlns:w16cei="http://schemas.microsoft.com/office/word/2026/wordml/cei" xmlns:w16cex="http://schemas.microsoft.com/office/word/2018/wordml/cex" xmlns:w16cid="http://schemas.microsoft.com/office/word/2016/wordml/cid" xmlns:w16="http://schemas.microsoft.com/office/word/2018/wordml" xmlns:w16du="http://schemas.microsoft.com/office/word/2023/wordml/word16du" xmlns:w16sdtdh="http://schemas.microsoft.com/office/word/2020/wordml/sdtdatahash" xmlns:w16sdtfl="http://schemas.microsoft.com/office/word/2024/wordml/sdtformatlock" xmlns:w16se="http://schemas.microsoft.com/office/word/2015/wordml/symex" xmlns:wpg="http://schemas.microsoft.com/office/word/2010/wordprocessingGroup" xmlns:wpi="http://schemas.microsoft.com/office/word/2010/wordprocessingInk" xmlns:wne="http://schemas.microsoft.com/office/word/2006/wordml" xmlns:wps="http://schemas.microsoft.com/office/word/2010/wordprocessingShape" mc:Ignorable="w14 w15 w16se w16cid w16 w16cex w16sdtdh w16sdtfl w16du wp14">
   <w:footnote w:type="separator" w:id="-1">
     <w:p>
       <w:r>
@@ -16736,7 +17463,7 @@
 </file>
 
 <file path=word/numbering.xml><?xml version="1.0" encoding="utf-8"?>
-<w:numbering xmlns:wpc="http://schemas.microsoft.com/office/word/2010/wordprocessingCanvas" xmlns:cx="http://schemas.microsoft.com/office/drawing/2014/chartex" xmlns:cx1="http://schemas.microsoft.com/office/drawing/2015/9/8/chartex" xmlns:cx2="http://schemas.microsoft.com/office/drawing/2015/10/21/chartex" xmlns:cx3="http://schemas.microsoft.com/office/drawing/2016/5/9/chartex" xmlns:cx4="http://schemas.microsoft.com/office/drawing/2016/5/10/chartex" xmlns:cx5="http://schemas.microsoft.com/office/drawing/2016/5/11/chartex" xmlns:cx6="http://schemas.microsoft.com/office/drawing/2016/5/12/chartex" xmlns:cx7="http://schemas.microsoft.com/office/drawing/2016/5/13/chartex" xmlns:cx8="http://schemas.microsoft.com/office/drawing/2016/5/14/chartex" xmlns:mc="http://schemas.openxmlformats.org/markup-compatibility/2006" xmlns:aink="http://schemas.microsoft.com/office/drawing/2016/ink" xmlns:am3d="http://schemas.microsoft.com/office/drawing/2017/model3d" xmlns:o="urn:schemas-microsoft-com:office:office" xmlns:oel="http://schemas.microsoft.com/office/2019/extlst" xmlns:r="http://schemas.openxmlformats.org/officeDocument/2006/relationships" xmlns:m="http://schemas.openxmlformats.org/officeDocument/2006/math" xmlns:v="urn:schemas-microsoft-com:vml" xmlns:wp14="http://schemas.microsoft.com/office/word/2010/wordprocessingDrawing" xmlns:wp="http://schemas.openxmlformats.org/drawingml/2006/wordprocessingDrawing" xmlns:w10="urn:schemas-microsoft-com:office:word" xmlns:w="http://schemas.openxmlformats.org/wordprocessingml/2006/main" xmlns:w14="http://schemas.microsoft.com/office/word/2010/wordml" xmlns:w15="http://schemas.microsoft.com/office/word/2012/wordml" xmlns:w16cex="http://schemas.microsoft.com/office/word/2018/wordml/cex" xmlns:w16cid="http://schemas.microsoft.com/office/word/2016/wordml/cid" xmlns:w16="http://schemas.microsoft.com/office/word/2018/wordml" xmlns:w16du="http://schemas.microsoft.com/office/word/2023/wordml/word16du" xmlns:w16sdtdh="http://schemas.microsoft.com/office/word/2020/wordml/sdtdatahash" xmlns:w16sdtfl="http://schemas.microsoft.com/office/word/2024/wordml/sdtformatlock" xmlns:w16se="http://schemas.microsoft.com/office/word/2015/wordml/symex" xmlns:wpg="http://schemas.microsoft.com/office/word/2010/wordprocessingGroup" xmlns:wpi="http://schemas.microsoft.com/office/word/2010/wordprocessingInk" xmlns:wne="http://schemas.microsoft.com/office/word/2006/wordml" xmlns:wps="http://schemas.microsoft.com/office/word/2010/wordprocessingShape" mc:Ignorable="w14 w15 w16se w16cid w16 w16cex w16sdtdh w16sdtfl w16du wp14">
+<w:numbering xmlns:wpc="http://schemas.microsoft.com/office/word/2010/wordprocessingCanvas" xmlns:cx="http://schemas.microsoft.com/office/drawing/2014/chartex" xmlns:cx1="http://schemas.microsoft.com/office/drawing/2015/9/8/chartex" xmlns:cx2="http://schemas.microsoft.com/office/drawing/2015/10/21/chartex" xmlns:cx3="http://schemas.microsoft.com/office/drawing/2016/5/9/chartex" xmlns:cx4="http://schemas.microsoft.com/office/drawing/2016/5/10/chartex" xmlns:cx5="http://schemas.microsoft.com/office/drawing/2016/5/11/chartex" xmlns:cx6="http://schemas.microsoft.com/office/drawing/2016/5/12/chartex" xmlns:cx7="http://schemas.microsoft.com/office/drawing/2016/5/13/chartex" xmlns:cx8="http://schemas.microsoft.com/office/drawing/2016/5/14/chartex" xmlns:mc="http://schemas.openxmlformats.org/markup-compatibility/2006" xmlns:aink="http://schemas.microsoft.com/office/drawing/2016/ink" xmlns:am3d="http://schemas.microsoft.com/office/drawing/2017/model3d" xmlns:o="urn:schemas-microsoft-com:office:office" xmlns:oel="http://schemas.microsoft.com/office/2019/extlst" xmlns:r="http://schemas.openxmlformats.org/officeDocument/2006/relationships" xmlns:m="http://schemas.openxmlformats.org/officeDocument/2006/math" xmlns:v="urn:schemas-microsoft-com:vml" xmlns:wp14="http://schemas.microsoft.com/office/word/2010/wordprocessingDrawing" xmlns:wp="http://schemas.openxmlformats.org/drawingml/2006/wordprocessingDrawing" xmlns:w10="urn:schemas-microsoft-com:office:word" xmlns:w="http://schemas.openxmlformats.org/wordprocessingml/2006/main" xmlns:w14="http://schemas.microsoft.com/office/word/2010/wordml" xmlns:w15="http://schemas.microsoft.com/office/word/2012/wordml" xmlns:w16cei="http://schemas.microsoft.com/office/word/2026/wordml/cei" xmlns:w16cex="http://schemas.microsoft.com/office/word/2018/wordml/cex" xmlns:w16cid="http://schemas.microsoft.com/office/word/2016/wordml/cid" xmlns:w16="http://schemas.microsoft.com/office/word/2018/wordml" xmlns:w16du="http://schemas.microsoft.com/office/word/2023/wordml/word16du" xmlns:w16sdtdh="http://schemas.microsoft.com/office/word/2020/wordml/sdtdatahash" xmlns:w16sdtfl="http://schemas.microsoft.com/office/word/2024/wordml/sdtformatlock" xmlns:w16se="http://schemas.microsoft.com/office/word/2015/wordml/symex" xmlns:wpg="http://schemas.microsoft.com/office/word/2010/wordprocessingGroup" xmlns:wpi="http://schemas.microsoft.com/office/word/2010/wordprocessingInk" xmlns:wne="http://schemas.microsoft.com/office/word/2006/wordml" xmlns:wps="http://schemas.microsoft.com/office/word/2010/wordprocessingShape" mc:Ignorable="w14 w15 w16se w16cid w16 w16cex w16sdtdh w16sdtfl w16du wp14">
   <w:abstractNum w:abstractNumId="0" w15:restartNumberingAfterBreak="0">
     <w:nsid w:val="074C2DB9"/>
     <w:multiLevelType w:val="hybridMultilevel"/>
@@ -17318,6 +18045,7 @@
   <w:style w:type="character" w:default="1" w:styleId="Fuentedeprrafopredeter">
     <w:name w:val="Default Paragraph Font"/>
     <w:uiPriority w:val="1"/>
+    <w:semiHidden/>
     <w:unhideWhenUsed/>
   </w:style>
   <w:style w:type="table" w:default="1" w:styleId="Tablanormal">

</xml_diff>